<commit_message>
Add Go unit tests for the proxy gateway
Cover config helpers, the HTTP reverse proxy and the TCP relay. Split
serveTCP into serveTCP and serveListener so tests can use a loopback
listener. Update the testing document.

Co-Authored-By: Claude Sonnet 5.5 <noreply@anthropic.com>
</commit_message>
<xml_diff>
--- a/doc/mlw-storage_Testing.docx
+++ b/doc/mlw-storage_Testing.docx
@@ -31,7 +31,7 @@
     </w:p>
     <w:p>
       <w:r>
-        <w:t>This document describes how to verify the mlw-storage stack: the SFTPGo file server and the Go proxy gateway that fronts it. The tests are manual, end-to-end procedures run against the running Docker Compose stack, plus a static check of the Go source. The repository has no automated test suite yet.</w:t>
+        <w:t>This document describes how to verify the mlw-storage stack: the SFTPGo file server and the Go proxy gateway that fronts it. It has two layers: Go unit tests for the gateway (automated, no running stack needed) and manual end-to-end procedures run against the running Docker Compose stack.</w:t>
       </w:r>
     </w:p>
     <w:p>
@@ -1385,12 +1385,12 @@
         <w:pStyle w:val="Heading1"/>
       </w:pPr>
       <w:r>
-        <w:t>7. Static checks</w:t>
+        <w:t>7. Unit tests and static checks</w:t>
       </w:r>
     </w:p>
     <w:p>
       <w:r>
-        <w:t>Go is not required on the host. Run formatting and vet inside a Go container:</w:t>
+        <w:t>The gateway has Go unit tests in src/main_test.go. Go is not required on the host; run them in a Go container (the Debian-based image is used because the race detector needs cgo):</w:t>
       </w:r>
     </w:p>
     <w:p>
@@ -1402,14 +1402,38 @@
           <w:rFonts w:ascii="Consolas" w:hAnsi="Consolas" w:eastAsia="Consolas"/>
           <w:sz w:val="18"/>
         </w:rPr>
-        <w:t>docker run --rm -v "$PWD/src:/src" -w /src golang:1.22-alpine \</w:t>
+        <w:t>docker run --rm -v "$PWD/src:/src" -w /src golang:1.22 \</w:t>
         <w:br/>
-        <w:t xml:space="preserve">  sh -c 'test -z "$(gofmt -l .)" &amp;&amp; go vet ./... &amp;&amp; echo clean'</w:t>
+        <w:t xml:space="preserve">  sh -c 'test -z "$(gofmt -l .)" &amp;&amp; go vet ./... &amp;&amp; go test -race -count=1 ./...'</w:t>
       </w:r>
     </w:p>
     <w:p>
       <w:r>
-        <w:t>Expected output: clean.</w:t>
+        <w:t>Expected output: ok for the package, with no gofmt or vet complaints. The tests cover:</w:t>
+      </w:r>
+    </w:p>
+    <w:p>
+      <w:pPr>
+        <w:pStyle w:val="ListBullet"/>
+      </w:pPr>
+      <w:r>
+        <w:t>Configuration helpers: env defaults, listen-address normalisation (0 and empty disable a feature, bare ports gain a colon) and passive port-range parsing, including invalid input.</w:t>
+      </w:r>
+    </w:p>
+    <w:p>
+      <w:pPr>
+        <w:pStyle w:val="ListBullet"/>
+      </w:pPr>
+      <w:r>
+        <w:t>HTTP reverse proxy: path and query forwarding, original Host preserved, X-Forwarded-* headers set, upstream response passed through, and 502 'upstream unavailable' when the upstream is down.</w:t>
+      </w:r>
+    </w:p>
+    <w:p>
+      <w:pPr>
+        <w:pStyle w:val="ListBullet"/>
+      </w:pPr>
+      <w:r>
+        <w:t>TCP relay: echo round trip, a 2 MB transfer with half-close (the full response is delivered before EOF), client closed when the upstream is unreachable, clean return on cancellation, and an error when the listen port is already in use.</w:t>
       </w:r>
     </w:p>
     <w:p>
@@ -1695,7 +1719,7 @@
         <w:pStyle w:val="ListBullet"/>
       </w:pPr>
       <w:r>
-        <w:t>No automated test suite or CI; the tests above are manual.</w:t>
+        <w:t>No CI: the unit tests must be run by hand, and the end-to-end procedures are manual.</w:t>
       </w:r>
     </w:p>
     <w:p>
@@ -1703,7 +1727,7 @@
         <w:pStyle w:val="ListBullet"/>
       </w:pPr>
       <w:r>
-        <w:t>The gateway has no Go unit tests (for example for the listen-address and port-range parsing).</w:t>
+        <w:t>The unit tests do not cover main() wiring (environment parsing at startup, optional FTP/WebDAV listeners, graceful shutdown); those are checked by the end-to-end tests.</w:t>
       </w:r>
     </w:p>
     <w:p>

</xml_diff>

<commit_message>
Add GitHub Actions workflow to run the tests
Run gofmt, go vet and go test -race for the gateway, validate the compose
file and build the gateway image. Mention CI in the testing document.

Co-Authored-By: Claude Sonnet 5.5 <noreply@anthropic.com>
</commit_message>
<xml_diff>
--- a/doc/mlw-storage_Testing.docx
+++ b/doc/mlw-storage_Testing.docx
@@ -1409,7 +1409,7 @@
     </w:p>
     <w:p>
       <w:r>
-        <w:t>Expected output: ok for the package, with no gofmt or vet complaints. The tests cover:</w:t>
+        <w:t>Expected output: ok for the package, with no gofmt or vet complaints. The same checks run in GitHub Actions (.github/workflows/test.yml) on every push to main and on pull requests, together with a compose file validation and a build of the gateway image. The tests cover:</w:t>
       </w:r>
     </w:p>
     <w:p>
@@ -1719,7 +1719,7 @@
         <w:pStyle w:val="ListBullet"/>
       </w:pPr>
       <w:r>
-        <w:t>No CI: the unit tests must be run by hand, and the end-to-end procedures are manual.</w:t>
+        <w:t>CI runs only the unit tests, static checks, compose validation and image build; the end-to-end procedures are manual.</w:t>
       </w:r>
     </w:p>
     <w:p>

</xml_diff>

<commit_message>
Add Keycloak token login, per-user root selection and user guide
The gateway can authenticate SFTP logins with Keycloak access tokens
through an SFTPGo external auth hook (disabled by default, enabled with
docker-compose.keycloak.yml). The SSH username must equal the token's
sub and the user must hold the required realm role. Non-token passwords
are rejected: an empty hook answer makes SFTPGo accept any password.

Users choose an existing directory under data/shared as their SFTP root
through an HTTP API on the gateway. Add unit tests, extend CI, and add
the user guide plus updates to the architecture and testing documents.

Co-Authored-By: Claude Sonnet 5.5 <noreply@anthropic.com>
</commit_message>
<xml_diff>
--- a/doc/mlw-storage_Testing.docx
+++ b/doc/mlw-storage_Testing.docx
@@ -1075,6 +1075,848 @@
         <w:pStyle w:val="Heading1"/>
       </w:pPr>
       <w:r>
+        <w:t>5a. Keycloak token login tests (optional feature)</w:t>
+      </w:r>
+    </w:p>
+    <w:p>
+      <w:r>
+        <w:t>Requires the Keycloak stack running with realm mlw (container mlw-keycloak, http://localhost:8180). Enable the feature in .env and restart:</w:t>
+      </w:r>
+    </w:p>
+    <w:p>
+      <w:pPr>
+        <w:ind w:left="288"/>
+      </w:pPr>
+      <w:r>
+        <w:rPr>
+          <w:rFonts w:ascii="Consolas" w:hAnsi="Consolas" w:eastAsia="Consolas"/>
+          <w:sz w:val="18"/>
+        </w:rPr>
+        <w:t>COMPOSE_FILE=docker-compose.yml:docker-compose.keycloak.yml</w:t>
+        <w:br/>
+        <w:br/>
+        <w:t>docker compose up -d --build</w:t>
+      </w:r>
+    </w:p>
+    <w:p>
+      <w:r>
+        <w:t>The proxy log should list the Keycloak auth hook with the issuer, key URL and required role. Obtain a token for a test user (the mlw-platform development realm has user mlw / mlw and client mlw-app) and use the token's sub as the SSH username. The client must send the token as the SSH password, for example with Python paramiko (auth_password).</w:t>
+      </w:r>
+    </w:p>
+    <w:p>
+      <w:pPr>
+        <w:ind w:left="288"/>
+      </w:pPr>
+      <w:r>
+        <w:rPr>
+          <w:rFonts w:ascii="Consolas" w:hAnsi="Consolas" w:eastAsia="Consolas"/>
+          <w:sz w:val="18"/>
+        </w:rPr>
+        <w:t>curl -s -d grant_type=password -d client_id=mlw-app -d username=mlw -d password=mlw \</w:t>
+        <w:br/>
+        <w:t xml:space="preserve">  http://localhost:8180/realms/mlw/protocol/openid-connect/token</w:t>
+      </w:r>
+    </w:p>
+    <w:tbl>
+      <w:tblPr>
+        <w:tblStyle w:val="TableGrid"/>
+        <w:tblW w:type="auto" w:w="0"/>
+        <w:tblLayout w:type="fixed"/>
+        <w:tblLook w:firstColumn="1" w:firstRow="1" w:lastColumn="0" w:lastRow="0" w:noHBand="0" w:noVBand="1" w:val="04A0"/>
+      </w:tblPr>
+      <w:tblGrid>
+        <w:gridCol w:w="3120"/>
+        <w:gridCol w:w="3120"/>
+        <w:gridCol w:w="3120"/>
+      </w:tblGrid>
+      <w:tr>
+        <w:tc>
+          <w:tcPr>
+            <w:tcW w:type="dxa" w:w="720"/>
+            <w:shd w:val="clear" w:color="auto" w:fill="DCE6F1"/>
+          </w:tcPr>
+          <w:p>
+            <w:pPr>
+              <w:spacing w:after="40"/>
+            </w:pPr>
+            <w:r>
+              <w:rPr>
+                <w:sz w:val="20"/>
+              </w:rPr>
+            </w:r>
+            <w:r>
+              <w:rPr>
+                <w:b/>
+                <w:sz w:val="20"/>
+              </w:rPr>
+              <w:t>ID</w:t>
+            </w:r>
+          </w:p>
+        </w:tc>
+        <w:tc>
+          <w:tcPr>
+            <w:tcW w:type="dxa" w:w="4464"/>
+            <w:shd w:val="clear" w:color="auto" w:fill="DCE6F1"/>
+          </w:tcPr>
+          <w:p>
+            <w:pPr>
+              <w:spacing w:after="40"/>
+            </w:pPr>
+            <w:r>
+              <w:rPr>
+                <w:sz w:val="20"/>
+              </w:rPr>
+            </w:r>
+            <w:r>
+              <w:rPr>
+                <w:b/>
+                <w:sz w:val="20"/>
+              </w:rPr>
+              <w:t>Test</w:t>
+            </w:r>
+          </w:p>
+        </w:tc>
+        <w:tc>
+          <w:tcPr>
+            <w:tcW w:type="dxa" w:w="4176"/>
+            <w:shd w:val="clear" w:color="auto" w:fill="DCE6F1"/>
+          </w:tcPr>
+          <w:p>
+            <w:pPr>
+              <w:spacing w:after="40"/>
+            </w:pPr>
+            <w:r>
+              <w:rPr>
+                <w:sz w:val="20"/>
+              </w:rPr>
+            </w:r>
+            <w:r>
+              <w:rPr>
+                <w:b/>
+                <w:sz w:val="20"/>
+              </w:rPr>
+              <w:t>Expected result</w:t>
+            </w:r>
+          </w:p>
+        </w:tc>
+      </w:tr>
+      <w:tr>
+        <w:tc>
+          <w:tcPr>
+            <w:tcW w:type="dxa" w:w="720"/>
+          </w:tcPr>
+          <w:p>
+            <w:pPr>
+              <w:spacing w:after="40"/>
+            </w:pPr>
+            <w:r>
+              <w:rPr>
+                <w:sz w:val="20"/>
+              </w:rPr>
+              <w:t>T13</w:t>
+            </w:r>
+          </w:p>
+        </w:tc>
+        <w:tc>
+          <w:tcPr>
+            <w:tcW w:type="dxa" w:w="4464"/>
+          </w:tcPr>
+          <w:p>
+            <w:pPr>
+              <w:spacing w:after="40"/>
+            </w:pPr>
+            <w:r>
+              <w:rPr>
+                <w:sz w:val="20"/>
+              </w:rPr>
+              <w:t>SFTP login with username = sub and password = valid token</w:t>
+            </w:r>
+          </w:p>
+        </w:tc>
+        <w:tc>
+          <w:tcPr>
+            <w:tcW w:type="dxa" w:w="4176"/>
+          </w:tcPr>
+          <w:p>
+            <w:pPr>
+              <w:spacing w:after="40"/>
+            </w:pPr>
+            <w:r>
+              <w:rPr>
+                <w:sz w:val="20"/>
+              </w:rPr>
+              <w:t>Login succeeds; the user is created with home directory data/users/&lt;sub&gt;</w:t>
+            </w:r>
+          </w:p>
+        </w:tc>
+      </w:tr>
+      <w:tr>
+        <w:tc>
+          <w:tcPr>
+            <w:tcW w:type="dxa" w:w="720"/>
+          </w:tcPr>
+          <w:p>
+            <w:pPr>
+              <w:spacing w:after="40"/>
+            </w:pPr>
+            <w:r>
+              <w:rPr>
+                <w:sz w:val="20"/>
+              </w:rPr>
+              <w:t>T14</w:t>
+            </w:r>
+          </w:p>
+        </w:tc>
+        <w:tc>
+          <w:tcPr>
+            <w:tcW w:type="dxa" w:w="4464"/>
+          </w:tcPr>
+          <w:p>
+            <w:pPr>
+              <w:spacing w:after="40"/>
+            </w:pPr>
+            <w:r>
+              <w:rPr>
+                <w:sz w:val="20"/>
+              </w:rPr>
+              <w:t>Save and reopen a file over SFTP, then check ./data/users/&lt;sub&gt;</w:t>
+            </w:r>
+          </w:p>
+        </w:tc>
+        <w:tc>
+          <w:tcPr>
+            <w:tcW w:type="dxa" w:w="4176"/>
+          </w:tcPr>
+          <w:p>
+            <w:pPr>
+              <w:spacing w:after="40"/>
+            </w:pPr>
+            <w:r>
+              <w:rPr>
+                <w:sz w:val="20"/>
+              </w:rPr>
+              <w:t>Checksum matches; the file is on the host file system</w:t>
+            </w:r>
+          </w:p>
+        </w:tc>
+      </w:tr>
+      <w:tr>
+        <w:tc>
+          <w:tcPr>
+            <w:tcW w:type="dxa" w:w="720"/>
+          </w:tcPr>
+          <w:p>
+            <w:pPr>
+              <w:spacing w:after="40"/>
+            </w:pPr>
+            <w:r>
+              <w:rPr>
+                <w:sz w:val="20"/>
+              </w:rPr>
+              <w:t>T15</w:t>
+            </w:r>
+          </w:p>
+        </w:tc>
+        <w:tc>
+          <w:tcPr>
+            <w:tcW w:type="dxa" w:w="4464"/>
+          </w:tcPr>
+          <w:p>
+            <w:pPr>
+              <w:spacing w:after="40"/>
+            </w:pPr>
+            <w:r>
+              <w:rPr>
+                <w:sz w:val="20"/>
+              </w:rPr>
+              <w:t>Login with a different username and the same token</w:t>
+            </w:r>
+          </w:p>
+        </w:tc>
+        <w:tc>
+          <w:tcPr>
+            <w:tcW w:type="dxa" w:w="4176"/>
+          </w:tcPr>
+          <w:p>
+            <w:pPr>
+              <w:spacing w:after="40"/>
+            </w:pPr>
+            <w:r>
+              <w:rPr>
+                <w:sz w:val="20"/>
+              </w:rPr>
+              <w:t>Rejected; proxy log: username does not match token sub</w:t>
+            </w:r>
+          </w:p>
+        </w:tc>
+      </w:tr>
+      <w:tr>
+        <w:tc>
+          <w:tcPr>
+            <w:tcW w:type="dxa" w:w="720"/>
+          </w:tcPr>
+          <w:p>
+            <w:pPr>
+              <w:spacing w:after="40"/>
+            </w:pPr>
+            <w:r>
+              <w:rPr>
+                <w:sz w:val="20"/>
+              </w:rPr>
+              <w:t>T16</w:t>
+            </w:r>
+          </w:p>
+        </w:tc>
+        <w:tc>
+          <w:tcPr>
+            <w:tcW w:type="dxa" w:w="4464"/>
+          </w:tcPr>
+          <w:p>
+            <w:pPr>
+              <w:spacing w:after="40"/>
+            </w:pPr>
+            <w:r>
+              <w:rPr>
+                <w:sz w:val="20"/>
+              </w:rPr>
+              <w:t>Login with a tampered token (change the last characters)</w:t>
+            </w:r>
+          </w:p>
+        </w:tc>
+        <w:tc>
+          <w:tcPr>
+            <w:tcW w:type="dxa" w:w="4176"/>
+          </w:tcPr>
+          <w:p>
+            <w:pPr>
+              <w:spacing w:after="40"/>
+            </w:pPr>
+            <w:r>
+              <w:rPr>
+                <w:sz w:val="20"/>
+              </w:rPr>
+              <w:t>Rejected; proxy log: token signature is invalid</w:t>
+            </w:r>
+          </w:p>
+        </w:tc>
+      </w:tr>
+      <w:tr>
+        <w:tc>
+          <w:tcPr>
+            <w:tcW w:type="dxa" w:w="720"/>
+          </w:tcPr>
+          <w:p>
+            <w:pPr>
+              <w:spacing w:after="40"/>
+            </w:pPr>
+            <w:r>
+              <w:rPr>
+                <w:sz w:val="20"/>
+              </w:rPr>
+              <w:t>T17</w:t>
+            </w:r>
+          </w:p>
+        </w:tc>
+        <w:tc>
+          <w:tcPr>
+            <w:tcW w:type="dxa" w:w="4464"/>
+          </w:tcPr>
+          <w:p>
+            <w:pPr>
+              <w:spacing w:after="40"/>
+            </w:pPr>
+            <w:r>
+              <w:rPr>
+                <w:sz w:val="20"/>
+              </w:rPr>
+              <w:t>Login with an ordinary password (any text that is not a token)</w:t>
+            </w:r>
+          </w:p>
+        </w:tc>
+        <w:tc>
+          <w:tcPr>
+            <w:tcW w:type="dxa" w:w="4176"/>
+          </w:tcPr>
+          <w:p>
+            <w:pPr>
+              <w:spacing w:after="40"/>
+            </w:pPr>
+            <w:r>
+              <w:rPr>
+                <w:sz w:val="20"/>
+              </w:rPr>
+              <w:t>Rejected, including for an existing local SFTPGo user with the right password</w:t>
+            </w:r>
+          </w:p>
+        </w:tc>
+      </w:tr>
+      <w:tr>
+        <w:tc>
+          <w:tcPr>
+            <w:tcW w:type="dxa" w:w="720"/>
+          </w:tcPr>
+          <w:p>
+            <w:pPr>
+              <w:spacing w:after="40"/>
+            </w:pPr>
+            <w:r>
+              <w:rPr>
+                <w:sz w:val="20"/>
+              </w:rPr>
+              <w:t>T18</w:t>
+            </w:r>
+          </w:p>
+        </w:tc>
+        <w:tc>
+          <w:tcPr>
+            <w:tcW w:type="dxa" w:w="4464"/>
+          </w:tcPr>
+          <w:p>
+            <w:pPr>
+              <w:spacing w:after="40"/>
+            </w:pPr>
+            <w:r>
+              <w:rPr>
+                <w:sz w:val="20"/>
+              </w:rPr>
+              <w:t>Second login with a freshly issued token</w:t>
+            </w:r>
+          </w:p>
+        </w:tc>
+        <w:tc>
+          <w:tcPr>
+            <w:tcW w:type="dxa" w:w="4176"/>
+          </w:tcPr>
+          <w:p>
+            <w:pPr>
+              <w:spacing w:after="40"/>
+            </w:pPr>
+            <w:r>
+              <w:rPr>
+                <w:sz w:val="20"/>
+              </w:rPr>
+              <w:t>Succeeds (the stored user is updated)</w:t>
+            </w:r>
+          </w:p>
+        </w:tc>
+      </w:tr>
+      <w:tr>
+        <w:tc>
+          <w:tcPr>
+            <w:tcW w:type="dxa" w:w="720"/>
+          </w:tcPr>
+          <w:p>
+            <w:pPr>
+              <w:spacing w:after="40"/>
+            </w:pPr>
+            <w:r>
+              <w:rPr>
+                <w:sz w:val="20"/>
+              </w:rPr>
+              <w:t>T19</w:t>
+            </w:r>
+          </w:p>
+        </w:tc>
+        <w:tc>
+          <w:tcPr>
+            <w:tcW w:type="dxa" w:w="4464"/>
+          </w:tcPr>
+          <w:p>
+            <w:pPr>
+              <w:spacing w:after="40"/>
+            </w:pPr>
+            <w:r>
+              <w:rPr>
+                <w:sz w:val="20"/>
+              </w:rPr>
+              <w:t>Set OIDC_READONLY_ROLE=mlw-user and log in again</w:t>
+            </w:r>
+          </w:p>
+        </w:tc>
+        <w:tc>
+          <w:tcPr>
+            <w:tcW w:type="dxa" w:w="4176"/>
+          </w:tcPr>
+          <w:p>
+            <w:pPr>
+              <w:spacing w:after="40"/>
+            </w:pPr>
+            <w:r>
+              <w:rPr>
+                <w:sz w:val="20"/>
+              </w:rPr>
+              <w:t>Listing and download work; upload is denied (permission denied)</w:t>
+            </w:r>
+          </w:p>
+        </w:tc>
+      </w:tr>
+      <w:tr>
+        <w:tc>
+          <w:tcPr>
+            <w:tcW w:type="dxa" w:w="720"/>
+          </w:tcPr>
+          <w:p>
+            <w:pPr>
+              <w:spacing w:after="40"/>
+            </w:pPr>
+            <w:r>
+              <w:rPr>
+                <w:sz w:val="20"/>
+              </w:rPr>
+              <w:t>T20</w:t>
+            </w:r>
+          </w:p>
+        </w:tc>
+        <w:tc>
+          <w:tcPr>
+            <w:tcW w:type="dxa" w:w="4464"/>
+          </w:tcPr>
+          <w:p>
+            <w:pPr>
+              <w:spacing w:after="40"/>
+            </w:pPr>
+            <w:r>
+              <w:rPr>
+                <w:sz w:val="20"/>
+              </w:rPr>
+              <w:t>User without the required role (or expired token)</w:t>
+            </w:r>
+          </w:p>
+        </w:tc>
+        <w:tc>
+          <w:tcPr>
+            <w:tcW w:type="dxa" w:w="4176"/>
+          </w:tcPr>
+          <w:p>
+            <w:pPr>
+              <w:spacing w:after="40"/>
+            </w:pPr>
+            <w:r>
+              <w:rPr>
+                <w:sz w:val="20"/>
+              </w:rPr>
+              <w:t>Rejected; covered by unit tests (the dev realm user has the role)</w:t>
+            </w:r>
+          </w:p>
+        </w:tc>
+      </w:tr>
+      <w:tr>
+        <w:tc>
+          <w:tcPr>
+            <w:tcW w:type="dxa" w:w="720"/>
+          </w:tcPr>
+          <w:p>
+            <w:pPr>
+              <w:spacing w:after="40"/>
+            </w:pPr>
+            <w:r>
+              <w:rPr>
+                <w:sz w:val="20"/>
+              </w:rPr>
+              <w:t>T21</w:t>
+            </w:r>
+          </w:p>
+        </w:tc>
+        <w:tc>
+          <w:tcPr>
+            <w:tcW w:type="dxa" w:w="4464"/>
+          </w:tcPr>
+          <w:p>
+            <w:pPr>
+              <w:spacing w:after="40"/>
+            </w:pPr>
+            <w:r>
+              <w:rPr>
+                <w:sz w:val="20"/>
+              </w:rPr>
+              <w:t>Create data/shared/projectA/hello.txt on the host; with a token call GET /mlw/v1/storage/dirs, then PUT /mlw/v1/storage/root {"path":"projectA"}</w:t>
+            </w:r>
+          </w:p>
+        </w:tc>
+        <w:tc>
+          <w:tcPr>
+            <w:tcW w:type="dxa" w:w="4176"/>
+          </w:tcPr>
+          <w:p>
+            <w:pPr>
+              <w:spacing w:after="40"/>
+            </w:pPr>
+            <w:r>
+              <w:rPr>
+                <w:sz w:val="20"/>
+              </w:rPr>
+              <w:t>dirs lists projectA; PUT returns the new root /srv/sftpgo/shared/projectA</w:t>
+            </w:r>
+          </w:p>
+        </w:tc>
+      </w:tr>
+      <w:tr>
+        <w:tc>
+          <w:tcPr>
+            <w:tcW w:type="dxa" w:w="720"/>
+          </w:tcPr>
+          <w:p>
+            <w:pPr>
+              <w:spacing w:after="40"/>
+            </w:pPr>
+            <w:r>
+              <w:rPr>
+                <w:sz w:val="20"/>
+              </w:rPr>
+              <w:t>T22</w:t>
+            </w:r>
+          </w:p>
+        </w:tc>
+        <w:tc>
+          <w:tcPr>
+            <w:tcW w:type="dxa" w:w="4464"/>
+          </w:tcPr>
+          <w:p>
+            <w:pPr>
+              <w:spacing w:after="40"/>
+            </w:pPr>
+            <w:r>
+              <w:rPr>
+                <w:sz w:val="20"/>
+              </w:rPr>
+              <w:t>SFTP login, list and read hello.txt, overwrite it, check the host file</w:t>
+            </w:r>
+          </w:p>
+        </w:tc>
+        <w:tc>
+          <w:tcPr>
+            <w:tcW w:type="dxa" w:w="4176"/>
+          </w:tcPr>
+          <w:p>
+            <w:pPr>
+              <w:spacing w:after="40"/>
+            </w:pPr>
+            <w:r>
+              <w:rPr>
+                <w:sz w:val="20"/>
+              </w:rPr>
+              <w:t>The existing file is listed and readable without any prior save; the host file shows the edit</w:t>
+            </w:r>
+          </w:p>
+        </w:tc>
+      </w:tr>
+      <w:tr>
+        <w:tc>
+          <w:tcPr>
+            <w:tcW w:type="dxa" w:w="720"/>
+          </w:tcPr>
+          <w:p>
+            <w:pPr>
+              <w:spacing w:after="40"/>
+            </w:pPr>
+            <w:r>
+              <w:rPr>
+                <w:sz w:val="20"/>
+              </w:rPr>
+              <w:t>T23</w:t>
+            </w:r>
+          </w:p>
+        </w:tc>
+        <w:tc>
+          <w:tcPr>
+            <w:tcW w:type="dxa" w:w="4464"/>
+          </w:tcPr>
+          <w:p>
+            <w:pPr>
+              <w:spacing w:after="40"/>
+            </w:pPr>
+            <w:r>
+              <w:rPr>
+                <w:sz w:val="20"/>
+              </w:rPr>
+              <w:t>PUT paths ../.., /etc, projectA/../../x and a missing directory</w:t>
+            </w:r>
+          </w:p>
+        </w:tc>
+        <w:tc>
+          <w:tcPr>
+            <w:tcW w:type="dxa" w:w="4176"/>
+          </w:tcPr>
+          <w:p>
+            <w:pPr>
+              <w:spacing w:after="40"/>
+            </w:pPr>
+            <w:r>
+              <w:rPr>
+                <w:sz w:val="20"/>
+              </w:rPr>
+              <w:t>Each returns HTTP 400 and the selection is unchanged</w:t>
+            </w:r>
+          </w:p>
+        </w:tc>
+      </w:tr>
+      <w:tr>
+        <w:tc>
+          <w:tcPr>
+            <w:tcW w:type="dxa" w:w="720"/>
+          </w:tcPr>
+          <w:p>
+            <w:pPr>
+              <w:spacing w:after="40"/>
+            </w:pPr>
+            <w:r>
+              <w:rPr>
+                <w:sz w:val="20"/>
+              </w:rPr>
+              <w:t>T24</w:t>
+            </w:r>
+          </w:p>
+        </w:tc>
+        <w:tc>
+          <w:tcPr>
+            <w:tcW w:type="dxa" w:w="4464"/>
+          </w:tcPr>
+          <w:p>
+            <w:pPr>
+              <w:spacing w:after="40"/>
+            </w:pPr>
+            <w:r>
+              <w:rPr>
+                <w:sz w:val="20"/>
+              </w:rPr>
+              <w:t>Select projectB, log in with a fresh token; then DELETE the selection and log in again</w:t>
+            </w:r>
+          </w:p>
+        </w:tc>
+        <w:tc>
+          <w:tcPr>
+            <w:tcW w:type="dxa" w:w="4176"/>
+          </w:tcPr>
+          <w:p>
+            <w:pPr>
+              <w:spacing w:after="40"/>
+            </w:pPr>
+            <w:r>
+              <w:rPr>
+                <w:sz w:val="20"/>
+              </w:rPr>
+              <w:t>First login sees projectB's files; after DELETE the root is the empty users/&lt;sub&gt; directory</w:t>
+            </w:r>
+          </w:p>
+        </w:tc>
+      </w:tr>
+      <w:tr>
+        <w:tc>
+          <w:tcPr>
+            <w:tcW w:type="dxa" w:w="720"/>
+          </w:tcPr>
+          <w:p>
+            <w:pPr>
+              <w:spacing w:after="40"/>
+            </w:pPr>
+            <w:r>
+              <w:rPr>
+                <w:sz w:val="20"/>
+              </w:rPr>
+              <w:t>T25</w:t>
+            </w:r>
+          </w:p>
+        </w:tc>
+        <w:tc>
+          <w:tcPr>
+            <w:tcW w:type="dxa" w:w="4464"/>
+          </w:tcPr>
+          <w:p>
+            <w:pPr>
+              <w:spacing w:after="40"/>
+            </w:pPr>
+            <w:r>
+              <w:rPr>
+                <w:sz w:val="20"/>
+              </w:rPr>
+              <w:t>Restart the proxy, then GET /mlw/v1/storage/root</w:t>
+            </w:r>
+          </w:p>
+        </w:tc>
+        <w:tc>
+          <w:tcPr>
+            <w:tcW w:type="dxa" w:w="4176"/>
+          </w:tcPr>
+          <w:p>
+            <w:pPr>
+              <w:spacing w:after="40"/>
+            </w:pPr>
+            <w:r>
+              <w:rPr>
+                <w:sz w:val="20"/>
+              </w:rPr>
+              <w:t>The selection is still there (stored in the proxy-state volume)</w:t>
+            </w:r>
+          </w:p>
+        </w:tc>
+      </w:tr>
+      <w:tr>
+        <w:tc>
+          <w:tcPr>
+            <w:tcW w:type="dxa" w:w="720"/>
+          </w:tcPr>
+          <w:p>
+            <w:pPr>
+              <w:spacing w:after="40"/>
+            </w:pPr>
+            <w:r>
+              <w:rPr>
+                <w:sz w:val="20"/>
+              </w:rPr>
+              <w:t>T26</w:t>
+            </w:r>
+          </w:p>
+        </w:tc>
+        <w:tc>
+          <w:tcPr>
+            <w:tcW w:type="dxa" w:w="4464"/>
+          </w:tcPr>
+          <w:p>
+            <w:pPr>
+              <w:spacing w:after="40"/>
+            </w:pPr>
+            <w:r>
+              <w:rPr>
+                <w:sz w:val="20"/>
+              </w:rPr>
+              <w:t>Call the API without a token, or with a token lacking the role</w:t>
+            </w:r>
+          </w:p>
+        </w:tc>
+        <w:tc>
+          <w:tcPr>
+            <w:tcW w:type="dxa" w:w="4176"/>
+          </w:tcPr>
+          <w:p>
+            <w:pPr>
+              <w:spacing w:after="40"/>
+            </w:pPr>
+            <w:r>
+              <w:rPr>
+                <w:sz w:val="20"/>
+              </w:rPr>
+              <w:t>401 and 403 respectively; no selection is changed</w:t>
+            </w:r>
+          </w:p>
+        </w:tc>
+      </w:tr>
+    </w:tbl>
+    <w:p/>
+    <w:p>
+      <w:r>
+        <w:t>For T21 to T25 create the shared directory first (mkdir -p data/shared) and use paths relative to it. The API is on the gateway web port, for example http://localhost:8380/mlw/v1/storage/root with the header Authorization: Bearer &lt;token&gt;.</w:t>
+      </w:r>
+    </w:p>
+    <w:p>
+      <w:r>
+        <w:t>T17 is a security check. SFTPGo accepts any password if the hook answers 200 with an empty body, so it must be verified after any change to the hook. To return to the default configuration remove COMPOSE_FILE from .env and run docker compose up -d; delete the test users in the SFTPGo admin and remove ./data/users.</w:t>
+      </w:r>
+    </w:p>
+    <w:p>
+      <w:pPr>
+        <w:pStyle w:val="Heading1"/>
+      </w:pPr>
+      <w:r>
         <w:t>6. Failure behaviour</w:t>
       </w:r>
     </w:p>
@@ -1417,6 +2259,22 @@
         <w:pStyle w:val="ListBullet"/>
       </w:pPr>
       <w:r>
+        <w:t>Directory selection: path validation (absolute paths, '..', symlink escapes, files, missing directories, NUL bytes), persistence and corrupt state files, users being independent, the login hook handing SFTPGo the chosen directory and refusing the login if it has vanished, directory listing, and the HTTP API (flow, authentication and role checks, bad requests).</w:t>
+      </w:r>
+    </w:p>
+    <w:p>
+      <w:pPr>
+        <w:pStyle w:val="ListBullet"/>
+      </w:pPr>
+      <w:r>
+        <w:t>Keycloak token authentication: RS256 signature, issuer, expiry (required), subject and token type checks; rejection of alg none, HS256 alg-confusion tokens, wrong or unknown signing keys, tampered and garbage tokens; allowed-client check; signing-key cache with refresh on rotation (rate limited); and the SFTPGo hook itself (user provisioning, username must equal sub, required and read-only roles, non-token passwords always 403, method and body validation).</w:t>
+      </w:r>
+    </w:p>
+    <w:p>
+      <w:pPr>
+        <w:pStyle w:val="ListBullet"/>
+      </w:pPr>
+      <w:r>
         <w:t>Configuration helpers: env defaults, listen-address normalisation (0 and empty disable a feature, bare ports gain a colon) and passive port-range parsing, including invalid input.</w:t>
       </w:r>
     </w:p>
@@ -1728,6 +2586,14 @@
       </w:pPr>
       <w:r>
         <w:t>The unit tests do not cover main() wiring (environment parsing at startup, optional FTP/WebDAV listeners, graceful shutdown); those are checked by the end-to-end tests.</w:t>
+      </w:r>
+    </w:p>
+    <w:p>
+      <w:pPr>
+        <w:pStyle w:val="ListBullet"/>
+      </w:pPr>
+      <w:r>
+        <w:t>The Keycloak tests need a live Keycloak and a client that sends a password over SSH; they are manual and not run in CI.</w:t>
       </w:r>
     </w:p>
     <w:p>

</xml_diff>

<commit_message>
Update User Guide and Testing docs for production; create default SFTPGo admin
Set SFTPGO_DATA_PROVIDER__CREATE_DEFAULT_ADMIN so recent SFTPGo versions
honour SFTPGO_DEFAULT_ADMIN_* on a fresh volume.

Co-Authored-By: Claude Sonnet 5.5 <noreply@anthropic.com>
</commit_message>
<xml_diff>
--- a/doc/mlw-storage_Testing.docx
+++ b/doc/mlw-storage_Testing.docx
@@ -378,7 +378,7 @@
           <w:rPr>
             <w:b/>
           </w:rPr>
-          <w:t xml:space="preserve">4</w:t>
+          <w:t xml:space="preserve">5</w:t>
         </w:r>
         <w:r>
           <w:rPr>
@@ -454,7 +454,7 @@
           <w:rPr>
             <w:b/>
           </w:rPr>
-          <w:t xml:space="preserve">6. Failure behaviour</w:t>
+          <w:t xml:space="preserve">5b. Production configuration tests</w:t>
         </w:r>
         <w:r>
           <w:rPr>
@@ -507,7 +507,7 @@
           <w:rPr>
             <w:b/>
           </w:rPr>
-          <w:t xml:space="preserve">7. Unit tests and static checks</w:t>
+          <w:t xml:space="preserve">6. Failure behaviour</w:t>
         </w:r>
         <w:r>
           <w:rPr>
@@ -537,7 +537,7 @@
           <w:rPr>
             <w:b/>
           </w:rPr>
-          <w:t xml:space="preserve">7</w:t>
+          <w:t xml:space="preserve">8</w:t>
         </w:r>
         <w:r>
           <w:rPr>
@@ -560,7 +560,7 @@
           <w:rPr>
             <w:b/>
           </w:rPr>
-          <w:t xml:space="preserve">8. Cleanup</w:t>
+          <w:t xml:space="preserve">7. Unit tests and static checks</w:t>
         </w:r>
         <w:r>
           <w:rPr>
@@ -590,7 +590,7 @@
           <w:rPr>
             <w:b/>
           </w:rPr>
-          <w:t xml:space="preserve">8</w:t>
+          <w:t xml:space="preserve">9</w:t>
         </w:r>
         <w:r>
           <w:rPr>
@@ -613,7 +613,7 @@
           <w:rPr>
             <w:b/>
           </w:rPr>
-          <w:t xml:space="preserve">9. Troubleshooting</w:t>
+          <w:t xml:space="preserve">8. Cleanup</w:t>
         </w:r>
         <w:r>
           <w:rPr>
@@ -643,7 +643,7 @@
           <w:rPr>
             <w:b/>
           </w:rPr>
-          <w:t xml:space="preserve">9</w:t>
+          <w:t xml:space="preserve">10</w:t>
         </w:r>
         <w:r>
           <w:rPr>
@@ -666,7 +666,7 @@
           <w:rPr>
             <w:b/>
           </w:rPr>
-          <w:t xml:space="preserve">10. Known gaps</w:t>
+          <w:t xml:space="preserve">9. Troubleshooting</w:t>
         </w:r>
         <w:r>
           <w:rPr>
@@ -696,7 +696,60 @@
           <w:rPr>
             <w:b/>
           </w:rPr>
-          <w:t xml:space="preserve">9</w:t>
+          <w:t xml:space="preserve">10</w:t>
+        </w:r>
+        <w:r>
+          <w:rPr>
+            <w:b/>
+          </w:rPr>
+          <w:fldChar w:fldCharType="end"/>
+        </w:r>
+      </w:hyperlink>
+    </w:p>
+    <w:p>
+      <w:pPr>
+        <w:tabs>
+          <w:tab w:pos="9360" w:val="right" w:leader="dot"/>
+        </w:tabs>
+        <w:spacing w:after="80" w:before="120"/>
+        <w:ind w:left="0"/>
+      </w:pPr>
+      <w:hyperlink w:anchor="_Toc100011" w:history="1">
+        <w:r>
+          <w:rPr>
+            <w:b/>
+          </w:rPr>
+          <w:t xml:space="preserve">10. Known gaps</w:t>
+        </w:r>
+        <w:r>
+          <w:rPr>
+            <w:b/>
+          </w:rPr>
+          <w:tab/>
+        </w:r>
+        <w:r>
+          <w:rPr>
+            <w:b/>
+          </w:rPr>
+          <w:fldChar w:fldCharType="begin"/>
+        </w:r>
+        <w:r>
+          <w:rPr>
+            <w:b/>
+          </w:rPr>
+          <w:instrText xml:space="preserve"> PAGEREF _Toc100011 \h </w:instrText>
+        </w:r>
+        <w:r>
+          <w:rPr>
+            <w:b/>
+          </w:rPr>
+          <w:fldChar w:fldCharType="separate"/>
+        </w:r>
+        <w:r>
+          <w:rPr>
+            <w:b/>
+          </w:rPr>
+          <w:t xml:space="preserve">10</w:t>
         </w:r>
         <w:r>
           <w:rPr>
@@ -813,6 +866,20 @@
       <w:r>
         <w:rPr/>
         <w:t>A ./data directory owned by your user, created before the first start (mkdir -p data). If Docker creates it, it is owned by root and SFTPGo, which runs as uid 1000, cannot create user home directories.</w:t>
+      </w:r>
+    </w:p>
+    <w:p>
+      <w:pPr>
+        <w:pStyle w:val="ListBullet"/>
+        <w:numPr>
+          <w:ilvl w:val="0"/>
+          <w:numId w:val="1"/>
+        </w:numPr>
+        <w:rPr/>
+      </w:pPr>
+      <w:r>
+        <w:rPr/>
+        <w:t xml:space="preserve">For the production tests (section 5b): a pinned SFTPGo tag in SFTPGO_VERSION in .env (for example v2.7.6), and the development stack stopped, because both stacks use the same container names and ports.</w:t>
       </w:r>
     </w:p>
     <w:p>
@@ -4062,9 +4129,832 @@
       <w:bookmarkStart w:id="906" w:name="_Toc100006"/>
       <w:r>
         <w:rPr/>
+        <w:t>5b. Production configuration tests</w:t>
+      </w:r>
+      <w:bookmarkEnd w:id="906"/>
+    </w:p>
+    <w:p>
+      <w:pPr>
+        <w:pStyle w:val="Normal"/>
+        <w:rPr/>
+      </w:pPr>
+      <w:r>
+        <w:rPr/>
+        <w:t xml:space="preserve">Run these against the production stack, docker-compose.prod.yml. Select it in .env and set the version pin, then start it:</w:t>
+      </w:r>
+    </w:p>
+    <w:p>
+      <w:pPr>
+        <w:pStyle w:val="Normal"/>
+        <w:ind w:left="288"/>
+        <w:rPr/>
+      </w:pPr>
+      <w:r>
+        <w:rPr>
+          <w:rFonts w:eastAsia="Consolas" w:ascii="Consolas" w:hAnsi="Consolas"/>
+          <w:sz w:val="18"/>
+        </w:rPr>
+        <w:t xml:space="preserve">COMPOSE_FILE=docker-compose.prod.yml</w:t>
+        <w:br/>
+        <w:t xml:space="preserve">SFTPGO_VERSION=v2.7.6</w:t>
+        <w:br/>
+        <w:t xml:space="preserve"/>
+        <w:br/>
+        <w:t xml:space="preserve">docker compose up -d --build</w:t>
+      </w:r>
+    </w:p>
+    <w:tbl>
+      <w:tblPr>
+        <w:tblStyle w:val="TableGrid"/>
+        <w:tblW w:w="9360" w:type="dxa"/>
+        <w:jc w:val="left"/>
+        <w:tblInd w:w="0" w:type="dxa"/>
+        <w:tblLayout w:type="fixed"/>
+        <w:tblCellMar>
+          <w:top w:w="0" w:type="dxa"/>
+          <w:left w:w="108" w:type="dxa"/>
+          <w:bottom w:w="0" w:type="dxa"/>
+          <w:right w:w="108" w:type="dxa"/>
+        </w:tblCellMar>
+        <w:tblLook w:val="04a0" w:noHBand="0" w:noVBand="1" w:firstColumn="1" w:lastRow="0" w:lastColumn="0" w:firstRow="1"/>
+      </w:tblPr>
+      <w:tblGrid>
+        <w:gridCol w:w="3120"/>
+        <w:gridCol w:w="3120"/>
+        <w:gridCol w:w="3120"/>
+      </w:tblGrid>
+      <w:tr>
+        <w:trPr/>
+        <w:tc>
+          <w:tcPr>
+            <w:tcW w:w="3120" w:type="dxa"/>
+            <w:tcBorders/>
+            <w:shd w:color="auto" w:fill="DCE6F1" w:val="clear"/>
+          </w:tcPr>
+          <w:p>
+            <w:pPr>
+              <w:pStyle w:val="Normal"/>
+              <w:widowControl/>
+              <w:spacing w:lineRule="auto" w:line="240" w:before="0" w:after="40"/>
+              <w:jc w:val="left"/>
+              <w:rPr>
+                <w:rFonts w:eastAsia="ＭＳ 明朝" w:cs=""/>
+                <w:kern w:val="0"/>
+                <w:szCs w:val="22"/>
+                <w:lang w:val="en-US" w:eastAsia="en-US" w:bidi="ar-SA"/>
+              </w:rPr>
+            </w:pPr>
+            <w:r>
+              <w:rPr>
+                <w:rFonts w:eastAsia="ＭＳ 明朝" w:cs=""/>
+                <w:b/>
+                <w:kern w:val="0"/>
+                <w:sz w:val="20"/>
+                <w:szCs w:val="22"/>
+                <w:lang w:val="en-US" w:eastAsia="en-US" w:bidi="ar-SA"/>
+              </w:rPr>
+              <w:t xml:space="preserve">ID</w:t>
+            </w:r>
+          </w:p>
+        </w:tc>
+        <w:tc>
+          <w:tcPr>
+            <w:tcW w:w="3120" w:type="dxa"/>
+            <w:tcBorders/>
+            <w:shd w:color="auto" w:fill="DCE6F1" w:val="clear"/>
+          </w:tcPr>
+          <w:p>
+            <w:pPr>
+              <w:pStyle w:val="Normal"/>
+              <w:widowControl/>
+              <w:spacing w:lineRule="auto" w:line="240" w:before="0" w:after="40"/>
+              <w:jc w:val="left"/>
+              <w:rPr>
+                <w:rFonts w:eastAsia="ＭＳ 明朝" w:cs=""/>
+                <w:kern w:val="0"/>
+                <w:szCs w:val="22"/>
+                <w:lang w:val="en-US" w:eastAsia="en-US" w:bidi="ar-SA"/>
+              </w:rPr>
+            </w:pPr>
+            <w:r>
+              <w:rPr>
+                <w:rFonts w:eastAsia="ＭＳ 明朝" w:cs=""/>
+                <w:b/>
+                <w:kern w:val="0"/>
+                <w:sz w:val="20"/>
+                <w:szCs w:val="22"/>
+                <w:lang w:val="en-US" w:eastAsia="en-US" w:bidi="ar-SA"/>
+              </w:rPr>
+              <w:t xml:space="preserve">Test</w:t>
+            </w:r>
+          </w:p>
+        </w:tc>
+        <w:tc>
+          <w:tcPr>
+            <w:tcW w:w="3120" w:type="dxa"/>
+            <w:tcBorders/>
+            <w:shd w:color="auto" w:fill="DCE6F1" w:val="clear"/>
+          </w:tcPr>
+          <w:p>
+            <w:pPr>
+              <w:pStyle w:val="Normal"/>
+              <w:widowControl/>
+              <w:spacing w:lineRule="auto" w:line="240" w:before="0" w:after="40"/>
+              <w:jc w:val="left"/>
+              <w:rPr>
+                <w:rFonts w:eastAsia="ＭＳ 明朝" w:cs=""/>
+                <w:kern w:val="0"/>
+                <w:szCs w:val="22"/>
+                <w:lang w:val="en-US" w:eastAsia="en-US" w:bidi="ar-SA"/>
+              </w:rPr>
+            </w:pPr>
+            <w:r>
+              <w:rPr>
+                <w:rFonts w:eastAsia="ＭＳ 明朝" w:cs=""/>
+                <w:b/>
+                <w:kern w:val="0"/>
+                <w:sz w:val="20"/>
+                <w:szCs w:val="22"/>
+                <w:lang w:val="en-US" w:eastAsia="en-US" w:bidi="ar-SA"/>
+              </w:rPr>
+              <w:t xml:space="preserve">Expected result</w:t>
+            </w:r>
+          </w:p>
+        </w:tc>
+      </w:tr>
+      <w:tr>
+        <w:trPr/>
+        <w:tc>
+          <w:tcPr>
+            <w:tcW w:w="3120" w:type="dxa"/>
+            <w:tcBorders/>
+          </w:tcPr>
+          <w:p>
+            <w:pPr>
+              <w:pStyle w:val="Normal"/>
+              <w:widowControl/>
+              <w:spacing w:lineRule="auto" w:line="240" w:before="0" w:after="40"/>
+              <w:jc w:val="left"/>
+              <w:rPr>
+                <w:rFonts w:eastAsia="ＭＳ 明朝" w:cs=""/>
+                <w:kern w:val="0"/>
+                <w:szCs w:val="22"/>
+                <w:lang w:val="en-US" w:eastAsia="en-US" w:bidi="ar-SA"/>
+              </w:rPr>
+            </w:pPr>
+            <w:r>
+              <w:rPr>
+                <w:rFonts w:eastAsia="ＭＳ 明朝" w:cs=""/>
+                <w:kern w:val="0"/>
+                <w:sz w:val="20"/>
+                <w:szCs w:val="22"/>
+                <w:lang w:val="en-US" w:eastAsia="en-US" w:bidi="ar-SA"/>
+              </w:rPr>
+              <w:t xml:space="preserve">T27</w:t>
+            </w:r>
+          </w:p>
+        </w:tc>
+        <w:tc>
+          <w:tcPr>
+            <w:tcW w:w="3120" w:type="dxa"/>
+            <w:tcBorders/>
+          </w:tcPr>
+          <w:p>
+            <w:pPr>
+              <w:pStyle w:val="Normal"/>
+              <w:widowControl/>
+              <w:spacing w:lineRule="auto" w:line="240" w:before="0" w:after="40"/>
+              <w:jc w:val="left"/>
+              <w:rPr>
+                <w:rFonts w:eastAsia="ＭＳ 明朝" w:cs=""/>
+                <w:kern w:val="0"/>
+                <w:szCs w:val="22"/>
+                <w:lang w:val="en-US" w:eastAsia="en-US" w:bidi="ar-SA"/>
+              </w:rPr>
+            </w:pPr>
+            <w:r>
+              <w:rPr>
+                <w:rFonts w:eastAsia="ＭＳ 明朝" w:cs=""/>
+                <w:kern w:val="0"/>
+                <w:sz w:val="20"/>
+                <w:szCs w:val="22"/>
+                <w:lang w:val="en-US" w:eastAsia="en-US" w:bidi="ar-SA"/>
+              </w:rPr>
+              <w:t xml:space="preserve">Unset SFTPGO_VERSION and run docker compose config -q</w:t>
+            </w:r>
+          </w:p>
+        </w:tc>
+        <w:tc>
+          <w:tcPr>
+            <w:tcW w:w="3120" w:type="dxa"/>
+            <w:tcBorders/>
+          </w:tcPr>
+          <w:p>
+            <w:pPr>
+              <w:pStyle w:val="Normal"/>
+              <w:widowControl/>
+              <w:spacing w:lineRule="auto" w:line="240" w:before="0" w:after="40"/>
+              <w:jc w:val="left"/>
+              <w:rPr>
+                <w:rFonts w:eastAsia="ＭＳ 明朝" w:cs=""/>
+                <w:kern w:val="0"/>
+                <w:szCs w:val="22"/>
+                <w:lang w:val="en-US" w:eastAsia="en-US" w:bidi="ar-SA"/>
+              </w:rPr>
+            </w:pPr>
+            <w:r>
+              <w:rPr>
+                <w:rFonts w:eastAsia="ＭＳ 明朝" w:cs=""/>
+                <w:kern w:val="0"/>
+                <w:sz w:val="20"/>
+                <w:szCs w:val="22"/>
+                <w:lang w:val="en-US" w:eastAsia="en-US" w:bidi="ar-SA"/>
+              </w:rPr>
+              <w:t xml:space="preserve">Fails with: required variable SFTPGO_VERSION is missing a value</w:t>
+            </w:r>
+          </w:p>
+        </w:tc>
+      </w:tr>
+      <w:tr>
+        <w:trPr/>
+        <w:tc>
+          <w:tcPr>
+            <w:tcW w:w="3120" w:type="dxa"/>
+            <w:tcBorders/>
+          </w:tcPr>
+          <w:p>
+            <w:pPr>
+              <w:pStyle w:val="Normal"/>
+              <w:widowControl/>
+              <w:spacing w:lineRule="auto" w:line="240" w:before="0" w:after="40"/>
+              <w:jc w:val="left"/>
+              <w:rPr>
+                <w:rFonts w:eastAsia="ＭＳ 明朝" w:cs=""/>
+                <w:kern w:val="0"/>
+                <w:szCs w:val="22"/>
+                <w:lang w:val="en-US" w:eastAsia="en-US" w:bidi="ar-SA"/>
+              </w:rPr>
+            </w:pPr>
+            <w:r>
+              <w:rPr>
+                <w:rFonts w:eastAsia="ＭＳ 明朝" w:cs=""/>
+                <w:kern w:val="0"/>
+                <w:sz w:val="20"/>
+                <w:szCs w:val="22"/>
+                <w:lang w:val="en-US" w:eastAsia="en-US" w:bidi="ar-SA"/>
+              </w:rPr>
+              <w:t xml:space="preserve">T28</w:t>
+            </w:r>
+          </w:p>
+        </w:tc>
+        <w:tc>
+          <w:tcPr>
+            <w:tcW w:w="3120" w:type="dxa"/>
+            <w:tcBorders/>
+          </w:tcPr>
+          <w:p>
+            <w:pPr>
+              <w:pStyle w:val="Normal"/>
+              <w:widowControl/>
+              <w:spacing w:lineRule="auto" w:line="240" w:before="0" w:after="40"/>
+              <w:jc w:val="left"/>
+              <w:rPr>
+                <w:rFonts w:eastAsia="ＭＳ 明朝" w:cs=""/>
+                <w:kern w:val="0"/>
+                <w:szCs w:val="22"/>
+                <w:lang w:val="en-US" w:eastAsia="en-US" w:bidi="ar-SA"/>
+              </w:rPr>
+            </w:pPr>
+            <w:r>
+              <w:rPr>
+                <w:rFonts w:eastAsia="ＭＳ 明朝" w:cs=""/>
+                <w:kern w:val="0"/>
+                <w:sz w:val="20"/>
+                <w:szCs w:val="22"/>
+                <w:lang w:val="en-US" w:eastAsia="en-US" w:bidi="ar-SA"/>
+              </w:rPr>
+              <w:t xml:space="preserve">docker compose up -d --build, then docker compose ps and docker image ls mlw-storage-proxy</w:t>
+            </w:r>
+          </w:p>
+        </w:tc>
+        <w:tc>
+          <w:tcPr>
+            <w:tcW w:w="3120" w:type="dxa"/>
+            <w:tcBorders/>
+          </w:tcPr>
+          <w:p>
+            <w:pPr>
+              <w:pStyle w:val="Normal"/>
+              <w:widowControl/>
+              <w:spacing w:lineRule="auto" w:line="240" w:before="0" w:after="40"/>
+              <w:jc w:val="left"/>
+              <w:rPr>
+                <w:rFonts w:eastAsia="ＭＳ 明朝" w:cs=""/>
+                <w:kern w:val="0"/>
+                <w:szCs w:val="22"/>
+                <w:lang w:val="en-US" w:eastAsia="en-US" w:bidi="ar-SA"/>
+              </w:rPr>
+            </w:pPr>
+            <w:r>
+              <w:rPr>
+                <w:rFonts w:eastAsia="ＭＳ 明朝" w:cs=""/>
+                <w:kern w:val="0"/>
+                <w:sz w:val="20"/>
+                <w:szCs w:val="22"/>
+                <w:lang w:val="en-US" w:eastAsia="en-US" w:bidi="ar-SA"/>
+              </w:rPr>
+              <w:t xml:space="preserve">Both services are Up; the image mlw-storage-proxy:1.0.0 (or MLW_VERSION) exists</w:t>
+            </w:r>
+          </w:p>
+        </w:tc>
+      </w:tr>
+      <w:tr>
+        <w:trPr/>
+        <w:tc>
+          <w:tcPr>
+            <w:tcW w:w="3120" w:type="dxa"/>
+            <w:tcBorders/>
+          </w:tcPr>
+          <w:p>
+            <w:pPr>
+              <w:pStyle w:val="Normal"/>
+              <w:widowControl/>
+              <w:spacing w:lineRule="auto" w:line="240" w:before="0" w:after="40"/>
+              <w:jc w:val="left"/>
+              <w:rPr>
+                <w:rFonts w:eastAsia="ＭＳ 明朝" w:cs=""/>
+                <w:kern w:val="0"/>
+                <w:szCs w:val="22"/>
+                <w:lang w:val="en-US" w:eastAsia="en-US" w:bidi="ar-SA"/>
+              </w:rPr>
+            </w:pPr>
+            <w:r>
+              <w:rPr>
+                <w:rFonts w:eastAsia="ＭＳ 明朝" w:cs=""/>
+                <w:kern w:val="0"/>
+                <w:sz w:val="20"/>
+                <w:szCs w:val="22"/>
+                <w:lang w:val="en-US" w:eastAsia="en-US" w:bidi="ar-SA"/>
+              </w:rPr>
+              <w:t xml:space="preserve">T29</w:t>
+            </w:r>
+          </w:p>
+        </w:tc>
+        <w:tc>
+          <w:tcPr>
+            <w:tcW w:w="3120" w:type="dxa"/>
+            <w:tcBorders/>
+          </w:tcPr>
+          <w:p>
+            <w:pPr>
+              <w:pStyle w:val="Normal"/>
+              <w:widowControl/>
+              <w:spacing w:lineRule="auto" w:line="240" w:before="0" w:after="40"/>
+              <w:jc w:val="left"/>
+              <w:rPr>
+                <w:rFonts w:eastAsia="ＭＳ 明朝" w:cs=""/>
+                <w:kern w:val="0"/>
+                <w:szCs w:val="22"/>
+                <w:lang w:val="en-US" w:eastAsia="en-US" w:bidi="ar-SA"/>
+              </w:rPr>
+            </w:pPr>
+            <w:r>
+              <w:rPr>
+                <w:rFonts w:eastAsia="ＭＳ 明朝" w:cs=""/>
+                <w:kern w:val="0"/>
+                <w:sz w:val="20"/>
+                <w:szCs w:val="22"/>
+                <w:lang w:val="en-US" w:eastAsia="en-US" w:bidi="ar-SA"/>
+              </w:rPr>
+              <w:t xml:space="preserve">curl -s -o /dev/null -w "%{http_code}\n" http://localhost:8380/healthz, then the same for /web/admin/login</w:t>
+            </w:r>
+          </w:p>
+        </w:tc>
+        <w:tc>
+          <w:tcPr>
+            <w:tcW w:w="3120" w:type="dxa"/>
+            <w:tcBorders/>
+          </w:tcPr>
+          <w:p>
+            <w:pPr>
+              <w:pStyle w:val="Normal"/>
+              <w:widowControl/>
+              <w:spacing w:lineRule="auto" w:line="240" w:before="0" w:after="40"/>
+              <w:jc w:val="left"/>
+              <w:rPr>
+                <w:rFonts w:eastAsia="ＭＳ 明朝" w:cs=""/>
+                <w:kern w:val="0"/>
+                <w:szCs w:val="22"/>
+                <w:lang w:val="en-US" w:eastAsia="en-US" w:bidi="ar-SA"/>
+              </w:rPr>
+            </w:pPr>
+            <w:r>
+              <w:rPr>
+                <w:rFonts w:eastAsia="ＭＳ 明朝" w:cs=""/>
+                <w:kern w:val="0"/>
+                <w:sz w:val="20"/>
+                <w:szCs w:val="22"/>
+                <w:lang w:val="en-US" w:eastAsia="en-US" w:bidi="ar-SA"/>
+              </w:rPr>
+              <w:t xml:space="preserve">200, then 302 (redirect to the admin login)</w:t>
+            </w:r>
+          </w:p>
+        </w:tc>
+      </w:tr>
+      <w:tr>
+        <w:trPr/>
+        <w:tc>
+          <w:tcPr>
+            <w:tcW w:w="3120" w:type="dxa"/>
+            <w:tcBorders/>
+          </w:tcPr>
+          <w:p>
+            <w:pPr>
+              <w:pStyle w:val="Normal"/>
+              <w:widowControl/>
+              <w:spacing w:lineRule="auto" w:line="240" w:before="0" w:after="40"/>
+              <w:jc w:val="left"/>
+              <w:rPr>
+                <w:rFonts w:eastAsia="ＭＳ 明朝" w:cs=""/>
+                <w:kern w:val="0"/>
+                <w:szCs w:val="22"/>
+                <w:lang w:val="en-US" w:eastAsia="en-US" w:bidi="ar-SA"/>
+              </w:rPr>
+            </w:pPr>
+            <w:r>
+              <w:rPr>
+                <w:rFonts w:eastAsia="ＭＳ 明朝" w:cs=""/>
+                <w:kern w:val="0"/>
+                <w:sz w:val="20"/>
+                <w:szCs w:val="22"/>
+                <w:lang w:val="en-US" w:eastAsia="en-US" w:bidi="ar-SA"/>
+              </w:rPr>
+              <w:t xml:space="preserve">T30</w:t>
+            </w:r>
+          </w:p>
+        </w:tc>
+        <w:tc>
+          <w:tcPr>
+            <w:tcW w:w="3120" w:type="dxa"/>
+            <w:tcBorders/>
+          </w:tcPr>
+          <w:p>
+            <w:pPr>
+              <w:pStyle w:val="Normal"/>
+              <w:widowControl/>
+              <w:spacing w:lineRule="auto" w:line="240" w:before="0" w:after="40"/>
+              <w:jc w:val="left"/>
+              <w:rPr>
+                <w:rFonts w:eastAsia="ＭＳ 明朝" w:cs=""/>
+                <w:kern w:val="0"/>
+                <w:szCs w:val="22"/>
+                <w:lang w:val="en-US" w:eastAsia="en-US" w:bidi="ar-SA"/>
+              </w:rPr>
+            </w:pPr>
+            <w:r>
+              <w:rPr>
+                <w:rFonts w:eastAsia="ＭＳ 明朝" w:cs=""/>
+                <w:kern w:val="0"/>
+                <w:sz w:val="20"/>
+                <w:szCs w:val="22"/>
+                <w:lang w:val="en-US" w:eastAsia="en-US" w:bidi="ar-SA"/>
+              </w:rPr>
+              <w:t xml:space="preserve">docker inspect -f '{{.Name}} ro={{.HostConfig.ReadonlyRootfs}} cap={{.HostConfig.CapDrop}} sec={{.HostConfig.SecurityOpt}}' mlw-proxy sftpgo</w:t>
+            </w:r>
+          </w:p>
+        </w:tc>
+        <w:tc>
+          <w:tcPr>
+            <w:tcW w:w="3120" w:type="dxa"/>
+            <w:tcBorders/>
+          </w:tcPr>
+          <w:p>
+            <w:pPr>
+              <w:pStyle w:val="Normal"/>
+              <w:widowControl/>
+              <w:spacing w:lineRule="auto" w:line="240" w:before="0" w:after="40"/>
+              <w:jc w:val="left"/>
+              <w:rPr>
+                <w:rFonts w:eastAsia="ＭＳ 明朝" w:cs=""/>
+                <w:kern w:val="0"/>
+                <w:szCs w:val="22"/>
+                <w:lang w:val="en-US" w:eastAsia="en-US" w:bidi="ar-SA"/>
+              </w:rPr>
+            </w:pPr>
+            <w:r>
+              <w:rPr>
+                <w:rFonts w:eastAsia="ＭＳ 明朝" w:cs=""/>
+                <w:kern w:val="0"/>
+                <w:sz w:val="20"/>
+                <w:szCs w:val="22"/>
+                <w:lang w:val="en-US" w:eastAsia="en-US" w:bidi="ar-SA"/>
+              </w:rPr>
+              <w:t xml:space="preserve">Both: cap=[ALL] and sec=[no-new-privileges:true]; ro=true for mlw-proxy, ro=false for sftpgo</w:t>
+            </w:r>
+          </w:p>
+        </w:tc>
+      </w:tr>
+      <w:tr>
+        <w:trPr/>
+        <w:tc>
+          <w:tcPr>
+            <w:tcW w:w="3120" w:type="dxa"/>
+            <w:tcBorders/>
+          </w:tcPr>
+          <w:p>
+            <w:pPr>
+              <w:pStyle w:val="Normal"/>
+              <w:widowControl/>
+              <w:spacing w:lineRule="auto" w:line="240" w:before="0" w:after="40"/>
+              <w:jc w:val="left"/>
+              <w:rPr>
+                <w:rFonts w:eastAsia="ＭＳ 明朝" w:cs=""/>
+                <w:kern w:val="0"/>
+                <w:szCs w:val="22"/>
+                <w:lang w:val="en-US" w:eastAsia="en-US" w:bidi="ar-SA"/>
+              </w:rPr>
+            </w:pPr>
+            <w:r>
+              <w:rPr>
+                <w:rFonts w:eastAsia="ＭＳ 明朝" w:cs=""/>
+                <w:kern w:val="0"/>
+                <w:sz w:val="20"/>
+                <w:szCs w:val="22"/>
+                <w:lang w:val="en-US" w:eastAsia="en-US" w:bidi="ar-SA"/>
+              </w:rPr>
+              <w:t xml:space="preserve">T31</w:t>
+            </w:r>
+          </w:p>
+        </w:tc>
+        <w:tc>
+          <w:tcPr>
+            <w:tcW w:w="3120" w:type="dxa"/>
+            <w:tcBorders/>
+          </w:tcPr>
+          <w:p>
+            <w:pPr>
+              <w:pStyle w:val="Normal"/>
+              <w:widowControl/>
+              <w:spacing w:lineRule="auto" w:line="240" w:before="0" w:after="40"/>
+              <w:jc w:val="left"/>
+              <w:rPr>
+                <w:rFonts w:eastAsia="ＭＳ 明朝" w:cs=""/>
+                <w:kern w:val="0"/>
+                <w:szCs w:val="22"/>
+                <w:lang w:val="en-US" w:eastAsia="en-US" w:bidi="ar-SA"/>
+              </w:rPr>
+            </w:pPr>
+            <w:r>
+              <w:rPr>
+                <w:rFonts w:eastAsia="ＭＳ 明朝" w:cs=""/>
+                <w:kern w:val="0"/>
+                <w:sz w:val="20"/>
+                <w:szCs w:val="22"/>
+                <w:lang w:val="en-US" w:eastAsia="en-US" w:bidi="ar-SA"/>
+              </w:rPr>
+              <w:t xml:space="preserve">docker inspect -f '{{.Name}} {{.HostConfig.RestartPolicy.Name}} {{.HostConfig.LogConfig.Type}} {{.HostConfig.LogConfig.Config}}' mlw-proxy sftpgo</w:t>
+            </w:r>
+          </w:p>
+        </w:tc>
+        <w:tc>
+          <w:tcPr>
+            <w:tcW w:w="3120" w:type="dxa"/>
+            <w:tcBorders/>
+          </w:tcPr>
+          <w:p>
+            <w:pPr>
+              <w:pStyle w:val="Normal"/>
+              <w:widowControl/>
+              <w:spacing w:lineRule="auto" w:line="240" w:before="0" w:after="40"/>
+              <w:jc w:val="left"/>
+              <w:rPr>
+                <w:rFonts w:eastAsia="ＭＳ 明朝" w:cs=""/>
+                <w:kern w:val="0"/>
+                <w:szCs w:val="22"/>
+                <w:lang w:val="en-US" w:eastAsia="en-US" w:bidi="ar-SA"/>
+              </w:rPr>
+            </w:pPr>
+            <w:r>
+              <w:rPr>
+                <w:rFonts w:eastAsia="ＭＳ 明朝" w:cs=""/>
+                <w:kern w:val="0"/>
+                <w:sz w:val="20"/>
+                <w:szCs w:val="22"/>
+                <w:lang w:val="en-US" w:eastAsia="en-US" w:bidi="ar-SA"/>
+              </w:rPr>
+              <w:t xml:space="preserve">Both: always json-file map[max-file:5 max-size:10m]</w:t>
+            </w:r>
+          </w:p>
+        </w:tc>
+      </w:tr>
+      <w:tr>
+        <w:trPr/>
+        <w:tc>
+          <w:tcPr>
+            <w:tcW w:w="3120" w:type="dxa"/>
+            <w:tcBorders/>
+          </w:tcPr>
+          <w:p>
+            <w:pPr>
+              <w:pStyle w:val="Normal"/>
+              <w:widowControl/>
+              <w:spacing w:lineRule="auto" w:line="240" w:before="0" w:after="40"/>
+              <w:jc w:val="left"/>
+              <w:rPr>
+                <w:rFonts w:eastAsia="ＭＳ 明朝" w:cs=""/>
+                <w:kern w:val="0"/>
+                <w:szCs w:val="22"/>
+                <w:lang w:val="en-US" w:eastAsia="en-US" w:bidi="ar-SA"/>
+              </w:rPr>
+            </w:pPr>
+            <w:r>
+              <w:rPr>
+                <w:rFonts w:eastAsia="ＭＳ 明朝" w:cs=""/>
+                <w:kern w:val="0"/>
+                <w:sz w:val="20"/>
+                <w:szCs w:val="22"/>
+                <w:lang w:val="en-US" w:eastAsia="en-US" w:bidi="ar-SA"/>
+              </w:rPr>
+              <w:t xml:space="preserve">T32</w:t>
+            </w:r>
+          </w:p>
+        </w:tc>
+        <w:tc>
+          <w:tcPr>
+            <w:tcW w:w="3120" w:type="dxa"/>
+            <w:tcBorders/>
+          </w:tcPr>
+          <w:p>
+            <w:pPr>
+              <w:pStyle w:val="Normal"/>
+              <w:widowControl/>
+              <w:spacing w:lineRule="auto" w:line="240" w:before="0" w:after="40"/>
+              <w:jc w:val="left"/>
+              <w:rPr>
+                <w:rFonts w:eastAsia="ＭＳ 明朝" w:cs=""/>
+                <w:kern w:val="0"/>
+                <w:szCs w:val="22"/>
+                <w:lang w:val="en-US" w:eastAsia="en-US" w:bidi="ar-SA"/>
+              </w:rPr>
+            </w:pPr>
+            <w:r>
+              <w:rPr>
+                <w:rFonts w:eastAsia="ＭＳ 明朝" w:cs=""/>
+                <w:kern w:val="0"/>
+                <w:sz w:val="20"/>
+                <w:szCs w:val="22"/>
+                <w:lang w:val="en-US" w:eastAsia="en-US" w:bidi="ar-SA"/>
+              </w:rPr>
+              <w:t xml:space="preserve">Set MLW_BIND_ADDR=127.0.0.1 in .env, run docker compose up -d, then ss -ltn | grep -E ':(8380|2222) '</w:t>
+            </w:r>
+          </w:p>
+        </w:tc>
+        <w:tc>
+          <w:tcPr>
+            <w:tcW w:w="3120" w:type="dxa"/>
+            <w:tcBorders/>
+          </w:tcPr>
+          <w:p>
+            <w:pPr>
+              <w:pStyle w:val="Normal"/>
+              <w:widowControl/>
+              <w:spacing w:lineRule="auto" w:line="240" w:before="0" w:after="40"/>
+              <w:jc w:val="left"/>
+              <w:rPr>
+                <w:rFonts w:eastAsia="ＭＳ 明朝" w:cs=""/>
+                <w:kern w:val="0"/>
+                <w:szCs w:val="22"/>
+                <w:lang w:val="en-US" w:eastAsia="en-US" w:bidi="ar-SA"/>
+              </w:rPr>
+            </w:pPr>
+            <w:r>
+              <w:rPr>
+                <w:rFonts w:eastAsia="ＭＳ 明朝" w:cs=""/>
+                <w:kern w:val="0"/>
+                <w:sz w:val="20"/>
+                <w:szCs w:val="22"/>
+                <w:lang w:val="en-US" w:eastAsia="en-US" w:bidi="ar-SA"/>
+              </w:rPr>
+              <w:t xml:space="preserve">Both ports listen on 127.0.0.1 only; connections from another host are refused</w:t>
+            </w:r>
+          </w:p>
+        </w:tc>
+      </w:tr>
+      <w:tr>
+        <w:trPr/>
+        <w:tc>
+          <w:tcPr>
+            <w:tcW w:w="3120" w:type="dxa"/>
+            <w:tcBorders/>
+          </w:tcPr>
+          <w:p>
+            <w:pPr>
+              <w:pStyle w:val="Normal"/>
+              <w:widowControl/>
+              <w:spacing w:lineRule="auto" w:line="240" w:before="0" w:after="40"/>
+              <w:jc w:val="left"/>
+              <w:rPr>
+                <w:rFonts w:eastAsia="ＭＳ 明朝" w:cs=""/>
+                <w:kern w:val="0"/>
+                <w:szCs w:val="22"/>
+                <w:lang w:val="en-US" w:eastAsia="en-US" w:bidi="ar-SA"/>
+              </w:rPr>
+            </w:pPr>
+            <w:r>
+              <w:rPr>
+                <w:rFonts w:eastAsia="ＭＳ 明朝" w:cs=""/>
+                <w:kern w:val="0"/>
+                <w:sz w:val="20"/>
+                <w:szCs w:val="22"/>
+                <w:lang w:val="en-US" w:eastAsia="en-US" w:bidi="ar-SA"/>
+              </w:rPr>
+              <w:t xml:space="preserve">T33</w:t>
+            </w:r>
+          </w:p>
+        </w:tc>
+        <w:tc>
+          <w:tcPr>
+            <w:tcW w:w="3120" w:type="dxa"/>
+            <w:tcBorders/>
+          </w:tcPr>
+          <w:p>
+            <w:pPr>
+              <w:pStyle w:val="Normal"/>
+              <w:widowControl/>
+              <w:spacing w:lineRule="auto" w:line="240" w:before="0" w:after="40"/>
+              <w:jc w:val="left"/>
+              <w:rPr>
+                <w:rFonts w:eastAsia="ＭＳ 明朝" w:cs=""/>
+                <w:kern w:val="0"/>
+                <w:szCs w:val="22"/>
+                <w:lang w:val="en-US" w:eastAsia="en-US" w:bidi="ar-SA"/>
+              </w:rPr>
+            </w:pPr>
+            <w:r>
+              <w:rPr>
+                <w:rFonts w:eastAsia="ＭＳ 明朝" w:cs=""/>
+                <w:kern w:val="0"/>
+                <w:sz w:val="20"/>
+                <w:szCs w:val="22"/>
+                <w:lang w:val="en-US" w:eastAsia="en-US" w:bidi="ar-SA"/>
+              </w:rPr>
+              <w:t xml:space="preserve">Repeat the test setup (section 3) and T1 to T7 against the production stack</w:t>
+            </w:r>
+          </w:p>
+        </w:tc>
+        <w:tc>
+          <w:tcPr>
+            <w:tcW w:w="3120" w:type="dxa"/>
+            <w:tcBorders/>
+          </w:tcPr>
+          <w:p>
+            <w:pPr>
+              <w:pStyle w:val="Normal"/>
+              <w:widowControl/>
+              <w:spacing w:lineRule="auto" w:line="240" w:before="0" w:after="40"/>
+              <w:jc w:val="left"/>
+              <w:rPr>
+                <w:rFonts w:eastAsia="ＭＳ 明朝" w:cs=""/>
+                <w:kern w:val="0"/>
+                <w:szCs w:val="22"/>
+                <w:lang w:val="en-US" w:eastAsia="en-US" w:bidi="ar-SA"/>
+              </w:rPr>
+            </w:pPr>
+            <w:r>
+              <w:rPr>
+                <w:rFonts w:eastAsia="ＭＳ 明朝" w:cs=""/>
+                <w:kern w:val="0"/>
+                <w:sz w:val="20"/>
+                <w:szCs w:val="22"/>
+                <w:lang w:val="en-US" w:eastAsia="en-US" w:bidi="ar-SA"/>
+              </w:rPr>
+              <w:t xml:space="preserve">Same results as section 4; in particular the 5 MB SFTP upload and download through the read-only gateway keep a matching checksum</w:t>
+            </w:r>
+          </w:p>
+        </w:tc>
+      </w:tr>
+    </w:tbl>
+    <w:p>
+      <w:pPr>
+        <w:pStyle w:val="Normal"/>
+        <w:rPr/>
+      </w:pPr>
+      <w:r>
+        <w:rPr/>
+        <w:t xml:space="preserve">Notes for T32: set MLW_BIND_ADDR back to 0.0.0.0 (or remove it) afterwards. The first admin account is only created while the sftpgo-config volume is empty. To repeat section 5a on production, set COMPOSE_FILE=docker-compose.prod.yml:docker-compose.keycloak.yml; the tests apply unchanged.</w:t>
+      </w:r>
+    </w:p>
+    <w:p>
+      <w:pPr>
+        <w:pStyle w:val="Heading1"/>
+        <w:rPr/>
+      </w:pPr>
+      <w:bookmarkStart w:id="907" w:name="_Toc100007"/>
+      <w:r>
+        <w:rPr/>
         <w:t>6. Failure behaviour</w:t>
       </w:r>
-      <w:bookmarkEnd w:id="906"/>
+      <w:bookmarkEnd w:id="907"/>
     </w:p>
     <w:p>
       <w:pPr>
@@ -4596,12 +5486,12 @@
         <w:pStyle w:val="Heading1"/>
         <w:rPr/>
       </w:pPr>
-      <w:bookmarkStart w:id="907" w:name="_Toc100007"/>
+      <w:bookmarkStart w:id="908" w:name="_Toc100008"/>
       <w:r>
         <w:rPr/>
         <w:t>7. Unit tests and static checks</w:t>
       </w:r>
-      <w:bookmarkEnd w:id="907"/>
+      <w:bookmarkEnd w:id="908"/>
     </w:p>
     <w:p>
       <w:pPr>
@@ -4636,7 +5526,7 @@
       </w:pPr>
       <w:r>
         <w:rPr/>
-        <w:t>Expected output: ok for the package, with no gofmt or vet complaints. The same checks run in GitHub Actions (.github/workflows/test.yml) on every push to main and on pull requests, together with a compose file validation and a build of the gateway image. The tests cover:</w:t>
+        <w:t>Expected output: ok for the package, with no gofmt or vet complaints. The same checks run in GitHub Actions (.github/workflows/test.yml) on every push to main and on pull requests, together with validation of the development and production compose files (with and without the Keycloak override) and a build of the gateway image. The tests cover:</w:t>
       </w:r>
     </w:p>
     <w:p>
@@ -4714,12 +5604,12 @@
         <w:pStyle w:val="Heading1"/>
         <w:rPr/>
       </w:pPr>
-      <w:bookmarkStart w:id="908" w:name="_Toc100008"/>
+      <w:bookmarkStart w:id="909" w:name="_Toc100009"/>
       <w:r>
         <w:rPr/>
         <w:t>8. Cleanup</w:t>
       </w:r>
-      <w:bookmarkEnd w:id="908"/>
+      <w:bookmarkEnd w:id="909"/>
     </w:p>
     <w:p>
       <w:pPr>
@@ -4739,6 +5629,8 @@
         <w:t># restore FTP_PORT=0 and WEBDAV_PORT=0 in .env, then:</w:t>
         <w:br/>
         <w:t>docker compose up -d</w:t>
+        <w:br/>
+        <w:t># for the production stack add: -f docker-compose.prod.yml (or keep COMPOSE_FILE set in .env)</w:t>
       </w:r>
     </w:p>
     <w:p>
@@ -4756,12 +5648,12 @@
         <w:pStyle w:val="Heading1"/>
         <w:rPr/>
       </w:pPr>
-      <w:bookmarkStart w:id="909" w:name="_Toc100009"/>
+      <w:bookmarkStart w:id="910" w:name="_Toc100010"/>
       <w:r>
         <w:rPr/>
         <w:t>9. Troubleshooting</w:t>
       </w:r>
-      <w:bookmarkEnd w:id="909"/>
+      <w:bookmarkEnd w:id="910"/>
     </w:p>
     <w:tbl>
       <w:tblPr>
@@ -5179,12 +6071,12 @@
         <w:pStyle w:val="Heading1"/>
         <w:rPr/>
       </w:pPr>
-      <w:bookmarkStart w:id="910" w:name="_Toc100010"/>
+      <w:bookmarkStart w:id="911" w:name="_Toc100011"/>
       <w:r>
         <w:rPr/>
         <w:t>10. Known gaps</w:t>
       </w:r>
-      <w:bookmarkEnd w:id="910"/>
+      <w:bookmarkEnd w:id="911"/>
     </w:p>
     <w:p>
       <w:pPr>
@@ -5197,7 +6089,7 @@
       </w:pPr>
       <w:r>
         <w:rPr/>
-        <w:t>CI runs only the unit tests, static checks, compose validation and image build; the end-to-end procedures are manual.</w:t>
+        <w:t>CI runs only the unit tests, static checks, compose validation (development and production files) and image build; the end-to-end procedures, including the production tests T27 to T33, are manual. CI validates docker-compose.prod.yml but never starts it.</w:t>
       </w:r>
     </w:p>
     <w:p>

</xml_diff>

<commit_message>
Document drive detection in the architecture, user guide and testing docs
Co-Authored-By: Claude Sonnet 5.5 <noreply@anthropic.com>
</commit_message>
<xml_diff>
--- a/doc/mlw-storage_Testing.docx
+++ b/doc/mlw-storage_Testing.docx
@@ -560,7 +560,7 @@
           <w:rPr>
             <w:b/>
           </w:rPr>
-          <w:t xml:space="preserve">6. Failure behaviour</w:t>
+          <w:t xml:space="preserve">5d. Drive detection tests (optional feature)</w:t>
         </w:r>
         <w:r>
           <w:rPr>
@@ -613,7 +613,7 @@
           <w:rPr>
             <w:b/>
           </w:rPr>
-          <w:t xml:space="preserve">7. Unit tests and static checks</w:t>
+          <w:t xml:space="preserve">6. Failure behaviour</w:t>
         </w:r>
         <w:r>
           <w:rPr>
@@ -643,7 +643,7 @@
           <w:rPr>
             <w:b/>
           </w:rPr>
-          <w:t xml:space="preserve">10</w:t>
+          <w:t xml:space="preserve">12</w:t>
         </w:r>
         <w:r>
           <w:rPr>
@@ -666,7 +666,7 @@
           <w:rPr>
             <w:b/>
           </w:rPr>
-          <w:t xml:space="preserve">8. Cleanup</w:t>
+          <w:t xml:space="preserve">7. Unit tests and static checks</w:t>
         </w:r>
         <w:r>
           <w:rPr>
@@ -696,7 +696,7 @@
           <w:rPr>
             <w:b/>
           </w:rPr>
-          <w:t xml:space="preserve">11</w:t>
+          <w:t xml:space="preserve">12</w:t>
         </w:r>
         <w:r>
           <w:rPr>
@@ -719,7 +719,7 @@
           <w:rPr>
             <w:b/>
           </w:rPr>
-          <w:t xml:space="preserve">9. Troubleshooting</w:t>
+          <w:t xml:space="preserve">8. Cleanup</w:t>
         </w:r>
         <w:r>
           <w:rPr>
@@ -749,7 +749,7 @@
           <w:rPr>
             <w:b/>
           </w:rPr>
-          <w:t xml:space="preserve">12</w:t>
+          <w:t xml:space="preserve">13</w:t>
         </w:r>
         <w:r>
           <w:rPr>
@@ -772,7 +772,7 @@
           <w:rPr>
             <w:b/>
           </w:rPr>
-          <w:t xml:space="preserve">10. Known gaps</w:t>
+          <w:t xml:space="preserve">9. Troubleshooting</w:t>
         </w:r>
         <w:r>
           <w:rPr>
@@ -802,7 +802,60 @@
           <w:rPr>
             <w:b/>
           </w:rPr>
-          <w:t xml:space="preserve">12</w:t>
+          <w:t xml:space="preserve">14</w:t>
+        </w:r>
+        <w:r>
+          <w:rPr>
+            <w:b/>
+          </w:rPr>
+          <w:fldChar w:fldCharType="end"/>
+        </w:r>
+      </w:hyperlink>
+    </w:p>
+    <w:p>
+      <w:pPr>
+        <w:tabs>
+          <w:tab w:pos="9360" w:val="right" w:leader="dot"/>
+        </w:tabs>
+        <w:spacing w:after="80" w:before="120"/>
+        <w:ind w:left="0"/>
+      </w:pPr>
+      <w:hyperlink w:anchor="_Toc100013" w:history="1">
+        <w:r>
+          <w:rPr>
+            <w:b/>
+          </w:rPr>
+          <w:t xml:space="preserve">10. Known gaps</w:t>
+        </w:r>
+        <w:r>
+          <w:rPr>
+            <w:b/>
+          </w:rPr>
+          <w:tab/>
+        </w:r>
+        <w:r>
+          <w:rPr>
+            <w:b/>
+          </w:rPr>
+          <w:fldChar w:fldCharType="begin"/>
+        </w:r>
+        <w:r>
+          <w:rPr>
+            <w:b/>
+          </w:rPr>
+          <w:instrText xml:space="preserve"> PAGEREF _Toc100013 \h </w:instrText>
+        </w:r>
+        <w:r>
+          <w:rPr>
+            <w:b/>
+          </w:rPr>
+          <w:fldChar w:fldCharType="separate"/>
+        </w:r>
+        <w:r>
+          <w:rPr>
+            <w:b/>
+          </w:rPr>
+          <w:t xml:space="preserve">14</w:t>
         </w:r>
         <w:r>
           <w:rPr>
@@ -933,6 +986,20 @@
       <w:r>
         <w:rPr/>
         <w:t xml:space="preserve">For the production tests (section 5b): a pinned SFTPGo tag in SFTPGO_VERSION in .env (for example v2.7.6), and the development stack stopped, because both stacks use the same container names and ports.</w:t>
+      </w:r>
+    </w:p>
+    <w:p>
+      <w:pPr>
+        <w:pStyle w:val="ListBullet"/>
+        <w:numPr>
+          <w:ilvl w:val="0"/>
+          <w:numId w:val="1"/>
+        </w:numPr>
+        <w:rPr/>
+      </w:pPr>
+      <w:r>
+        <w:rPr/>
+        <w:t xml:space="preserve">For the drive detection tests (section 5d): a USB or external drive, or a disk image attached with udisksctl (udisks2) and made with mkfs.vfat (dosfstools); a desktop session that mounts drives under /media.</w:t>
       </w:r>
     </w:p>
     <w:p>
@@ -6180,9 +6247,1024 @@
       <w:bookmarkStart w:id="908" w:name="_Toc100008"/>
       <w:r>
         <w:rPr/>
+        <w:t>5d. Drive detection tests (optional feature)</w:t>
+      </w:r>
+      <w:bookmarkEnd w:id="908"/>
+    </w:p>
+    <w:p>
+      <w:pPr>
+        <w:pStyle w:val="Normal"/>
+        <w:rPr/>
+      </w:pPr>
+      <w:r>
+        <w:rPr/>
+        <w:t xml:space="preserve">Enable the feature in .env, restart, and sign in to the web UI. Use a real USB or external drive. To try the feature without one, create and attach a disk image; a loop device is virtual, so the first test shows that it is ignored, and then MLW_MEDIA_INCLUDE_VIRTUAL=true lets the later tests use it:</w:t>
+      </w:r>
+    </w:p>
+    <w:p>
+      <w:pPr>
+        <w:pStyle w:val="Normal"/>
+        <w:ind w:left="288"/>
+        <w:rPr/>
+      </w:pPr>
+      <w:r>
+        <w:rPr>
+          <w:rFonts w:eastAsia="Consolas" w:ascii="Consolas" w:hAnsi="Consolas"/>
+          <w:sz w:val="18"/>
+        </w:rPr>
+        <w:t xml:space="preserve">COMPOSE_FILE=docker-compose.yml:docker-compose.media.yml</w:t>
+        <w:br/>
+        <w:t xml:space="preserve"/>
+        <w:br/>
+        <w:t xml:space="preserve">docker compose up -d --build</w:t>
+        <w:br/>
+        <w:t xml:space="preserve"/>
+        <w:br/>
+        <w:t xml:space="preserve">truncate -s 64M usb.img &amp;&amp; mkfs.vfat -n MLWTEST usb.img</w:t>
+        <w:br/>
+        <w:t xml:space="preserve">udisksctl loop-setup -f usb.img     # prints /dev/loopN</w:t>
+        <w:br/>
+        <w:t xml:space="preserve">udisksctl mount -b /dev/loopN       # mounts under /media/&lt;user&gt;/MLWTEST</w:t>
+      </w:r>
+    </w:p>
+    <w:tbl>
+      <w:tblPr>
+        <w:tblStyle w:val="TableGrid"/>
+        <w:tblW w:w="9360" w:type="dxa"/>
+        <w:jc w:val="left"/>
+        <w:tblInd w:w="0" w:type="dxa"/>
+        <w:tblLayout w:type="fixed"/>
+        <w:tblCellMar>
+          <w:top w:w="0" w:type="dxa"/>
+          <w:left w:w="108" w:type="dxa"/>
+          <w:bottom w:w="0" w:type="dxa"/>
+          <w:right w:w="108" w:type="dxa"/>
+        </w:tblCellMar>
+        <w:tblLook w:val="04a0" w:noHBand="0" w:noVBand="1" w:firstColumn="1" w:lastRow="0" w:lastColumn="0" w:firstRow="1"/>
+      </w:tblPr>
+      <w:tblGrid>
+        <w:gridCol w:w="3120"/>
+        <w:gridCol w:w="3120"/>
+        <w:gridCol w:w="3120"/>
+      </w:tblGrid>
+      <w:tr>
+        <w:trPr/>
+        <w:tc>
+          <w:tcPr>
+            <w:tcW w:w="3120" w:type="dxa"/>
+            <w:tcBorders/>
+            <w:shd w:color="auto" w:fill="DCE6F1" w:val="clear"/>
+          </w:tcPr>
+          <w:p>
+            <w:pPr>
+              <w:pStyle w:val="Normal"/>
+              <w:widowControl/>
+              <w:spacing w:lineRule="auto" w:line="240" w:before="0" w:after="40"/>
+              <w:jc w:val="left"/>
+              <w:rPr>
+                <w:rFonts w:eastAsia="ＭＳ 明朝" w:cs=""/>
+                <w:kern w:val="0"/>
+                <w:szCs w:val="22"/>
+                <w:lang w:val="en-US" w:eastAsia="en-US" w:bidi="ar-SA"/>
+              </w:rPr>
+            </w:pPr>
+            <w:r>
+              <w:rPr>
+                <w:rFonts w:eastAsia="ＭＳ 明朝" w:cs=""/>
+                <w:b/>
+                <w:kern w:val="0"/>
+                <w:sz w:val="20"/>
+                <w:szCs w:val="22"/>
+                <w:lang w:val="en-US" w:eastAsia="en-US" w:bidi="ar-SA"/>
+              </w:rPr>
+              <w:t xml:space="preserve">ID</w:t>
+            </w:r>
+          </w:p>
+        </w:tc>
+        <w:tc>
+          <w:tcPr>
+            <w:tcW w:w="3120" w:type="dxa"/>
+            <w:tcBorders/>
+            <w:shd w:color="auto" w:fill="DCE6F1" w:val="clear"/>
+          </w:tcPr>
+          <w:p>
+            <w:pPr>
+              <w:pStyle w:val="Normal"/>
+              <w:widowControl/>
+              <w:spacing w:lineRule="auto" w:line="240" w:before="0" w:after="40"/>
+              <w:jc w:val="left"/>
+              <w:rPr>
+                <w:rFonts w:eastAsia="ＭＳ 明朝" w:cs=""/>
+                <w:kern w:val="0"/>
+                <w:szCs w:val="22"/>
+                <w:lang w:val="en-US" w:eastAsia="en-US" w:bidi="ar-SA"/>
+              </w:rPr>
+            </w:pPr>
+            <w:r>
+              <w:rPr>
+                <w:rFonts w:eastAsia="ＭＳ 明朝" w:cs=""/>
+                <w:b/>
+                <w:kern w:val="0"/>
+                <w:sz w:val="20"/>
+                <w:szCs w:val="22"/>
+                <w:lang w:val="en-US" w:eastAsia="en-US" w:bidi="ar-SA"/>
+              </w:rPr>
+              <w:t xml:space="preserve">Test</w:t>
+            </w:r>
+          </w:p>
+        </w:tc>
+        <w:tc>
+          <w:tcPr>
+            <w:tcW w:w="3120" w:type="dxa"/>
+            <w:tcBorders/>
+            <w:shd w:color="auto" w:fill="DCE6F1" w:val="clear"/>
+          </w:tcPr>
+          <w:p>
+            <w:pPr>
+              <w:pStyle w:val="Normal"/>
+              <w:widowControl/>
+              <w:spacing w:lineRule="auto" w:line="240" w:before="0" w:after="40"/>
+              <w:jc w:val="left"/>
+              <w:rPr>
+                <w:rFonts w:eastAsia="ＭＳ 明朝" w:cs=""/>
+                <w:kern w:val="0"/>
+                <w:szCs w:val="22"/>
+                <w:lang w:val="en-US" w:eastAsia="en-US" w:bidi="ar-SA"/>
+              </w:rPr>
+            </w:pPr>
+            <w:r>
+              <w:rPr>
+                <w:rFonts w:eastAsia="ＭＳ 明朝" w:cs=""/>
+                <w:b/>
+                <w:kern w:val="0"/>
+                <w:sz w:val="20"/>
+                <w:szCs w:val="22"/>
+                <w:lang w:val="en-US" w:eastAsia="en-US" w:bidi="ar-SA"/>
+              </w:rPr>
+              <w:t xml:space="preserve">Expected result</w:t>
+            </w:r>
+          </w:p>
+        </w:tc>
+      </w:tr>
+      <w:tr>
+        <w:trPr/>
+        <w:tc>
+          <w:tcPr>
+            <w:tcW w:w="3120" w:type="dxa"/>
+            <w:tcBorders/>
+          </w:tcPr>
+          <w:p>
+            <w:pPr>
+              <w:pStyle w:val="Normal"/>
+              <w:widowControl/>
+              <w:spacing w:lineRule="auto" w:line="240" w:before="0" w:after="40"/>
+              <w:jc w:val="left"/>
+              <w:rPr>
+                <w:rFonts w:eastAsia="ＭＳ 明朝" w:cs=""/>
+                <w:kern w:val="0"/>
+                <w:szCs w:val="22"/>
+                <w:lang w:val="en-US" w:eastAsia="en-US" w:bidi="ar-SA"/>
+              </w:rPr>
+            </w:pPr>
+            <w:r>
+              <w:rPr>
+                <w:rFonts w:eastAsia="ＭＳ 明朝" w:cs=""/>
+                <w:kern w:val="0"/>
+                <w:sz w:val="20"/>
+                <w:szCs w:val="22"/>
+                <w:lang w:val="en-US" w:eastAsia="en-US" w:bidi="ar-SA"/>
+              </w:rPr>
+              <w:t xml:space="preserve">T45</w:t>
+            </w:r>
+          </w:p>
+        </w:tc>
+        <w:tc>
+          <w:tcPr>
+            <w:tcW w:w="3120" w:type="dxa"/>
+            <w:tcBorders/>
+          </w:tcPr>
+          <w:p>
+            <w:pPr>
+              <w:pStyle w:val="Normal"/>
+              <w:widowControl/>
+              <w:spacing w:lineRule="auto" w:line="240" w:before="0" w:after="40"/>
+              <w:jc w:val="left"/>
+              <w:rPr>
+                <w:rFonts w:eastAsia="ＭＳ 明朝" w:cs=""/>
+                <w:kern w:val="0"/>
+                <w:szCs w:val="22"/>
+                <w:lang w:val="en-US" w:eastAsia="en-US" w:bidi="ar-SA"/>
+              </w:rPr>
+            </w:pPr>
+            <w:r>
+              <w:rPr>
+                <w:rFonts w:eastAsia="ＭＳ 明朝" w:cs=""/>
+                <w:kern w:val="0"/>
+                <w:sz w:val="20"/>
+                <w:szCs w:val="22"/>
+                <w:lang w:val="en-US" w:eastAsia="en-US" w:bidi="ar-SA"/>
+              </w:rPr>
+              <w:t xml:space="preserve">docker compose logs proxy | grep media, then docker inspect mlw-proxy -f '{{range .Mounts}}{{.Destination}} {{.Propagation}} rw={{.RW}}{{"\n"}}{{end}}'</w:t>
+            </w:r>
+          </w:p>
+        </w:tc>
+        <w:tc>
+          <w:tcPr>
+            <w:tcW w:w="3120" w:type="dxa"/>
+            <w:tcBorders/>
+          </w:tcPr>
+          <w:p>
+            <w:pPr>
+              <w:pStyle w:val="Normal"/>
+              <w:widowControl/>
+              <w:spacing w:lineRule="auto" w:line="240" w:before="0" w:after="40"/>
+              <w:jc w:val="left"/>
+              <w:rPr>
+                <w:rFonts w:eastAsia="ＭＳ 明朝" w:cs=""/>
+                <w:kern w:val="0"/>
+                <w:szCs w:val="22"/>
+                <w:lang w:val="en-US" w:eastAsia="en-US" w:bidi="ar-SA"/>
+              </w:rPr>
+            </w:pPr>
+            <w:r>
+              <w:rPr>
+                <w:rFonts w:eastAsia="ＭＳ 明朝" w:cs=""/>
+                <w:kern w:val="0"/>
+                <w:sz w:val="20"/>
+                <w:szCs w:val="22"/>
+                <w:lang w:val="en-US" w:eastAsia="en-US" w:bidi="ar-SA"/>
+              </w:rPr>
+              <w:t xml:space="preserve">"media: watching mounts below /host/media (host /media) for physical drives"; /host/media is rslave and rw=false; /run/udev is rw=false</w:t>
+            </w:r>
+          </w:p>
+        </w:tc>
+      </w:tr>
+      <w:tr>
+        <w:trPr/>
+        <w:tc>
+          <w:tcPr>
+            <w:tcW w:w="3120" w:type="dxa"/>
+            <w:tcBorders/>
+          </w:tcPr>
+          <w:p>
+            <w:pPr>
+              <w:pStyle w:val="Normal"/>
+              <w:widowControl/>
+              <w:spacing w:lineRule="auto" w:line="240" w:before="0" w:after="40"/>
+              <w:jc w:val="left"/>
+              <w:rPr>
+                <w:rFonts w:eastAsia="ＭＳ 明朝" w:cs=""/>
+                <w:kern w:val="0"/>
+                <w:szCs w:val="22"/>
+                <w:lang w:val="en-US" w:eastAsia="en-US" w:bidi="ar-SA"/>
+              </w:rPr>
+            </w:pPr>
+            <w:r>
+              <w:rPr>
+                <w:rFonts w:eastAsia="ＭＳ 明朝" w:cs=""/>
+                <w:kern w:val="0"/>
+                <w:sz w:val="20"/>
+                <w:szCs w:val="22"/>
+                <w:lang w:val="en-US" w:eastAsia="en-US" w:bidi="ar-SA"/>
+              </w:rPr>
+              <w:t xml:space="preserve">T46</w:t>
+            </w:r>
+          </w:p>
+        </w:tc>
+        <w:tc>
+          <w:tcPr>
+            <w:tcW w:w="3120" w:type="dxa"/>
+            <w:tcBorders/>
+          </w:tcPr>
+          <w:p>
+            <w:pPr>
+              <w:pStyle w:val="Normal"/>
+              <w:widowControl/>
+              <w:spacing w:lineRule="auto" w:line="240" w:before="0" w:after="40"/>
+              <w:jc w:val="left"/>
+              <w:rPr>
+                <w:rFonts w:eastAsia="ＭＳ 明朝" w:cs=""/>
+                <w:kern w:val="0"/>
+                <w:szCs w:val="22"/>
+                <w:lang w:val="en-US" w:eastAsia="en-US" w:bidi="ar-SA"/>
+              </w:rPr>
+            </w:pPr>
+            <w:r>
+              <w:rPr>
+                <w:rFonts w:eastAsia="ＭＳ 明朝" w:cs=""/>
+                <w:kern w:val="0"/>
+                <w:sz w:val="20"/>
+                <w:szCs w:val="22"/>
+                <w:lang w:val="en-US" w:eastAsia="en-US" w:bidi="ar-SA"/>
+              </w:rPr>
+              <w:t xml:space="preserve">Leave the stack idle for 10 seconds, then docker stats --no-stream mlw-proxy</w:t>
+            </w:r>
+          </w:p>
+        </w:tc>
+        <w:tc>
+          <w:tcPr>
+            <w:tcW w:w="3120" w:type="dxa"/>
+            <w:tcBorders/>
+          </w:tcPr>
+          <w:p>
+            <w:pPr>
+              <w:pStyle w:val="Normal"/>
+              <w:widowControl/>
+              <w:spacing w:lineRule="auto" w:line="240" w:before="0" w:after="40"/>
+              <w:jc w:val="left"/>
+              <w:rPr>
+                <w:rFonts w:eastAsia="ＭＳ 明朝" w:cs=""/>
+                <w:kern w:val="0"/>
+                <w:szCs w:val="22"/>
+                <w:lang w:val="en-US" w:eastAsia="en-US" w:bidi="ar-SA"/>
+              </w:rPr>
+            </w:pPr>
+            <w:r>
+              <w:rPr>
+                <w:rFonts w:eastAsia="ＭＳ 明朝" w:cs=""/>
+                <w:kern w:val="0"/>
+                <w:sz w:val="20"/>
+                <w:szCs w:val="22"/>
+                <w:lang w:val="en-US" w:eastAsia="en-US" w:bidi="ar-SA"/>
+              </w:rPr>
+              <w:t xml:space="preserve">CPU 0.00%: the gateway waits in epoll_wait and does no polling</w:t>
+            </w:r>
+          </w:p>
+        </w:tc>
+      </w:tr>
+      <w:tr>
+        <w:trPr/>
+        <w:tc>
+          <w:tcPr>
+            <w:tcW w:w="3120" w:type="dxa"/>
+            <w:tcBorders/>
+          </w:tcPr>
+          <w:p>
+            <w:pPr>
+              <w:pStyle w:val="Normal"/>
+              <w:widowControl/>
+              <w:spacing w:lineRule="auto" w:line="240" w:before="0" w:after="40"/>
+              <w:jc w:val="left"/>
+              <w:rPr>
+                <w:rFonts w:eastAsia="ＭＳ 明朝" w:cs=""/>
+                <w:kern w:val="0"/>
+                <w:szCs w:val="22"/>
+                <w:lang w:val="en-US" w:eastAsia="en-US" w:bidi="ar-SA"/>
+              </w:rPr>
+            </w:pPr>
+            <w:r>
+              <w:rPr>
+                <w:rFonts w:eastAsia="ＭＳ 明朝" w:cs=""/>
+                <w:kern w:val="0"/>
+                <w:sz w:val="20"/>
+                <w:szCs w:val="22"/>
+                <w:lang w:val="en-US" w:eastAsia="en-US" w:bidi="ar-SA"/>
+              </w:rPr>
+              <w:t xml:space="preserve">T47</w:t>
+            </w:r>
+          </w:p>
+        </w:tc>
+        <w:tc>
+          <w:tcPr>
+            <w:tcW w:w="3120" w:type="dxa"/>
+            <w:tcBorders/>
+          </w:tcPr>
+          <w:p>
+            <w:pPr>
+              <w:pStyle w:val="Normal"/>
+              <w:widowControl/>
+              <w:spacing w:lineRule="auto" w:line="240" w:before="0" w:after="40"/>
+              <w:jc w:val="left"/>
+              <w:rPr>
+                <w:rFonts w:eastAsia="ＭＳ 明朝" w:cs=""/>
+                <w:kern w:val="0"/>
+                <w:szCs w:val="22"/>
+                <w:lang w:val="en-US" w:eastAsia="en-US" w:bidi="ar-SA"/>
+              </w:rPr>
+            </w:pPr>
+            <w:r>
+              <w:rPr>
+                <w:rFonts w:eastAsia="ＭＳ 明朝" w:cs=""/>
+                <w:kern w:val="0"/>
+                <w:sz w:val="20"/>
+                <w:szCs w:val="22"/>
+                <w:lang w:val="en-US" w:eastAsia="en-US" w:bidi="ar-SA"/>
+              </w:rPr>
+              <w:t xml:space="preserve">With the default settings, attach and mount the disk image (loop device) while the stack runs, with the Drives page open</w:t>
+            </w:r>
+          </w:p>
+        </w:tc>
+        <w:tc>
+          <w:tcPr>
+            <w:tcW w:w="3120" w:type="dxa"/>
+            <w:tcBorders/>
+          </w:tcPr>
+          <w:p>
+            <w:pPr>
+              <w:pStyle w:val="Normal"/>
+              <w:widowControl/>
+              <w:spacing w:lineRule="auto" w:line="240" w:before="0" w:after="40"/>
+              <w:jc w:val="left"/>
+              <w:rPr>
+                <w:rFonts w:eastAsia="ＭＳ 明朝" w:cs=""/>
+                <w:kern w:val="0"/>
+                <w:szCs w:val="22"/>
+                <w:lang w:val="en-US" w:eastAsia="en-US" w:bidi="ar-SA"/>
+              </w:rPr>
+            </w:pPr>
+            <w:r>
+              <w:rPr>
+                <w:rFonts w:eastAsia="ＭＳ 明朝" w:cs=""/>
+                <w:kern w:val="0"/>
+                <w:sz w:val="20"/>
+                <w:szCs w:val="22"/>
+                <w:lang w:val="en-US" w:eastAsia="en-US" w:bidi="ar-SA"/>
+              </w:rPr>
+              <w:t xml:space="preserve">No "media: mounted" log line and nothing on the Drives page: virtual devices are ignored</w:t>
+            </w:r>
+          </w:p>
+        </w:tc>
+      </w:tr>
+      <w:tr>
+        <w:trPr/>
+        <w:tc>
+          <w:tcPr>
+            <w:tcW w:w="3120" w:type="dxa"/>
+            <w:tcBorders/>
+          </w:tcPr>
+          <w:p>
+            <w:pPr>
+              <w:pStyle w:val="Normal"/>
+              <w:widowControl/>
+              <w:spacing w:lineRule="auto" w:line="240" w:before="0" w:after="40"/>
+              <w:jc w:val="left"/>
+              <w:rPr>
+                <w:rFonts w:eastAsia="ＭＳ 明朝" w:cs=""/>
+                <w:kern w:val="0"/>
+                <w:szCs w:val="22"/>
+                <w:lang w:val="en-US" w:eastAsia="en-US" w:bidi="ar-SA"/>
+              </w:rPr>
+            </w:pPr>
+            <w:r>
+              <w:rPr>
+                <w:rFonts w:eastAsia="ＭＳ 明朝" w:cs=""/>
+                <w:kern w:val="0"/>
+                <w:sz w:val="20"/>
+                <w:szCs w:val="22"/>
+                <w:lang w:val="en-US" w:eastAsia="en-US" w:bidi="ar-SA"/>
+              </w:rPr>
+              <w:t xml:space="preserve">T48</w:t>
+            </w:r>
+          </w:p>
+        </w:tc>
+        <w:tc>
+          <w:tcPr>
+            <w:tcW w:w="3120" w:type="dxa"/>
+            <w:tcBorders/>
+          </w:tcPr>
+          <w:p>
+            <w:pPr>
+              <w:pStyle w:val="Normal"/>
+              <w:widowControl/>
+              <w:spacing w:lineRule="auto" w:line="240" w:before="0" w:after="40"/>
+              <w:jc w:val="left"/>
+              <w:rPr>
+                <w:rFonts w:eastAsia="ＭＳ 明朝" w:cs=""/>
+                <w:kern w:val="0"/>
+                <w:szCs w:val="22"/>
+                <w:lang w:val="en-US" w:eastAsia="en-US" w:bidi="ar-SA"/>
+              </w:rPr>
+            </w:pPr>
+            <w:r>
+              <w:rPr>
+                <w:rFonts w:eastAsia="ＭＳ 明朝" w:cs=""/>
+                <w:kern w:val="0"/>
+                <w:sz w:val="20"/>
+                <w:szCs w:val="22"/>
+                <w:lang w:val="en-US" w:eastAsia="en-US" w:bidi="ar-SA"/>
+              </w:rPr>
+              <w:t xml:space="preserve">Plug in a real drive (or set MLW_MEDIA_INCLUDE_VIRTUAL=true, run docker compose up -d, and mount the image again), with the Drives page open</w:t>
+            </w:r>
+          </w:p>
+        </w:tc>
+        <w:tc>
+          <w:tcPr>
+            <w:tcW w:w="3120" w:type="dxa"/>
+            <w:tcBorders/>
+          </w:tcPr>
+          <w:p>
+            <w:pPr>
+              <w:pStyle w:val="Normal"/>
+              <w:widowControl/>
+              <w:spacing w:lineRule="auto" w:line="240" w:before="0" w:after="40"/>
+              <w:jc w:val="left"/>
+              <w:rPr>
+                <w:rFonts w:eastAsia="ＭＳ 明朝" w:cs=""/>
+                <w:kern w:val="0"/>
+                <w:szCs w:val="22"/>
+                <w:lang w:val="en-US" w:eastAsia="en-US" w:bidi="ar-SA"/>
+              </w:rPr>
+            </w:pPr>
+            <w:r>
+              <w:rPr>
+                <w:rFonts w:eastAsia="ＭＳ 明朝" w:cs=""/>
+                <w:kern w:val="0"/>
+                <w:sz w:val="20"/>
+                <w:szCs w:val="22"/>
+                <w:lang w:val="en-US" w:eastAsia="en-US" w:bidi="ar-SA"/>
+              </w:rPr>
+              <w:t xml:space="preserve">Log line "media: mounted &lt;label&gt; (/dev/...) at /media/..." within a second; the page adds the drive without a reload as "New: not enabled" with Enable and Ignore, and a red count appears on the Drives link on every page</w:t>
+            </w:r>
+          </w:p>
+        </w:tc>
+      </w:tr>
+      <w:tr>
+        <w:trPr/>
+        <w:tc>
+          <w:tcPr>
+            <w:tcW w:w="3120" w:type="dxa"/>
+            <w:tcBorders/>
+          </w:tcPr>
+          <w:p>
+            <w:pPr>
+              <w:pStyle w:val="Normal"/>
+              <w:widowControl/>
+              <w:spacing w:lineRule="auto" w:line="240" w:before="0" w:after="40"/>
+              <w:jc w:val="left"/>
+              <w:rPr>
+                <w:rFonts w:eastAsia="ＭＳ 明朝" w:cs=""/>
+                <w:kern w:val="0"/>
+                <w:szCs w:val="22"/>
+                <w:lang w:val="en-US" w:eastAsia="en-US" w:bidi="ar-SA"/>
+              </w:rPr>
+            </w:pPr>
+            <w:r>
+              <w:rPr>
+                <w:rFonts w:eastAsia="ＭＳ 明朝" w:cs=""/>
+                <w:kern w:val="0"/>
+                <w:sz w:val="20"/>
+                <w:szCs w:val="22"/>
+                <w:lang w:val="en-US" w:eastAsia="en-US" w:bidi="ar-SA"/>
+              </w:rPr>
+              <w:t xml:space="preserve">T49</w:t>
+            </w:r>
+          </w:p>
+        </w:tc>
+        <w:tc>
+          <w:tcPr>
+            <w:tcW w:w="3120" w:type="dxa"/>
+            <w:tcBorders/>
+          </w:tcPr>
+          <w:p>
+            <w:pPr>
+              <w:pStyle w:val="Normal"/>
+              <w:widowControl/>
+              <w:spacing w:lineRule="auto" w:line="240" w:before="0" w:after="40"/>
+              <w:jc w:val="left"/>
+              <w:rPr>
+                <w:rFonts w:eastAsia="ＭＳ 明朝" w:cs=""/>
+                <w:kern w:val="0"/>
+                <w:szCs w:val="22"/>
+                <w:lang w:val="en-US" w:eastAsia="en-US" w:bidi="ar-SA"/>
+              </w:rPr>
+            </w:pPr>
+            <w:r>
+              <w:rPr>
+                <w:rFonts w:eastAsia="ＭＳ 明朝" w:cs=""/>
+                <w:kern w:val="0"/>
+                <w:sz w:val="20"/>
+                <w:szCs w:val="22"/>
+                <w:lang w:val="en-US" w:eastAsia="en-US" w:bidi="ar-SA"/>
+              </w:rPr>
+              <w:t xml:space="preserve">Press Enable</w:t>
+            </w:r>
+          </w:p>
+        </w:tc>
+        <w:tc>
+          <w:tcPr>
+            <w:tcW w:w="3120" w:type="dxa"/>
+            <w:tcBorders/>
+          </w:tcPr>
+          <w:p>
+            <w:pPr>
+              <w:pStyle w:val="Normal"/>
+              <w:widowControl/>
+              <w:spacing w:lineRule="auto" w:line="240" w:before="0" w:after="40"/>
+              <w:jc w:val="left"/>
+              <w:rPr>
+                <w:rFonts w:eastAsia="ＭＳ 明朝" w:cs=""/>
+                <w:kern w:val="0"/>
+                <w:szCs w:val="22"/>
+                <w:lang w:val="en-US" w:eastAsia="en-US" w:bidi="ar-SA"/>
+              </w:rPr>
+            </w:pPr>
+            <w:r>
+              <w:rPr>
+                <w:rFonts w:eastAsia="ＭＳ 明朝" w:cs=""/>
+                <w:kern w:val="0"/>
+                <w:sz w:val="20"/>
+                <w:szCs w:val="22"/>
+                <w:lang w:val="en-US" w:eastAsia="en-US" w:bidi="ar-SA"/>
+              </w:rPr>
+              <w:t xml:space="preserve">Status becomes Available, the button becomes Disable and the red count disappears; nothing changes in SFTPGo (user list unchanged)</w:t>
+            </w:r>
+          </w:p>
+        </w:tc>
+      </w:tr>
+      <w:tr>
+        <w:trPr/>
+        <w:tc>
+          <w:tcPr>
+            <w:tcW w:w="3120" w:type="dxa"/>
+            <w:tcBorders/>
+          </w:tcPr>
+          <w:p>
+            <w:pPr>
+              <w:pStyle w:val="Normal"/>
+              <w:widowControl/>
+              <w:spacing w:lineRule="auto" w:line="240" w:before="0" w:after="40"/>
+              <w:jc w:val="left"/>
+              <w:rPr>
+                <w:rFonts w:eastAsia="ＭＳ 明朝" w:cs=""/>
+                <w:kern w:val="0"/>
+                <w:szCs w:val="22"/>
+                <w:lang w:val="en-US" w:eastAsia="en-US" w:bidi="ar-SA"/>
+              </w:rPr>
+            </w:pPr>
+            <w:r>
+              <w:rPr>
+                <w:rFonts w:eastAsia="ＭＳ 明朝" w:cs=""/>
+                <w:kern w:val="0"/>
+                <w:sz w:val="20"/>
+                <w:szCs w:val="22"/>
+                <w:lang w:val="en-US" w:eastAsia="en-US" w:bidi="ar-SA"/>
+              </w:rPr>
+              <w:t xml:space="preserve">T50</w:t>
+            </w:r>
+          </w:p>
+        </w:tc>
+        <w:tc>
+          <w:tcPr>
+            <w:tcW w:w="3120" w:type="dxa"/>
+            <w:tcBorders/>
+          </w:tcPr>
+          <w:p>
+            <w:pPr>
+              <w:pStyle w:val="Normal"/>
+              <w:widowControl/>
+              <w:spacing w:lineRule="auto" w:line="240" w:before="0" w:after="40"/>
+              <w:jc w:val="left"/>
+              <w:rPr>
+                <w:rFonts w:eastAsia="ＭＳ 明朝" w:cs=""/>
+                <w:kern w:val="0"/>
+                <w:szCs w:val="22"/>
+                <w:lang w:val="en-US" w:eastAsia="en-US" w:bidi="ar-SA"/>
+              </w:rPr>
+            </w:pPr>
+            <w:r>
+              <w:rPr>
+                <w:rFonts w:eastAsia="ＭＳ 明朝" w:cs=""/>
+                <w:kern w:val="0"/>
+                <w:sz w:val="20"/>
+                <w:szCs w:val="22"/>
+                <w:lang w:val="en-US" w:eastAsia="en-US" w:bidi="ar-SA"/>
+              </w:rPr>
+              <w:t xml:space="preserve">Unmount the drive (udisksctl unmount -b /dev/loopN, or eject)</w:t>
+            </w:r>
+          </w:p>
+        </w:tc>
+        <w:tc>
+          <w:tcPr>
+            <w:tcW w:w="3120" w:type="dxa"/>
+            <w:tcBorders/>
+          </w:tcPr>
+          <w:p>
+            <w:pPr>
+              <w:pStyle w:val="Normal"/>
+              <w:widowControl/>
+              <w:spacing w:lineRule="auto" w:line="240" w:before="0" w:after="40"/>
+              <w:jc w:val="left"/>
+              <w:rPr>
+                <w:rFonts w:eastAsia="ＭＳ 明朝" w:cs=""/>
+                <w:kern w:val="0"/>
+                <w:szCs w:val="22"/>
+                <w:lang w:val="en-US" w:eastAsia="en-US" w:bidi="ar-SA"/>
+              </w:rPr>
+            </w:pPr>
+            <w:r>
+              <w:rPr>
+                <w:rFonts w:eastAsia="ＭＳ 明朝" w:cs=""/>
+                <w:kern w:val="0"/>
+                <w:sz w:val="20"/>
+                <w:szCs w:val="22"/>
+                <w:lang w:val="en-US" w:eastAsia="en-US" w:bidi="ar-SA"/>
+              </w:rPr>
+              <w:t xml:space="preserve">Log line "media: unmounted ..."; the page changes without a reload to "Not mounted" with a Remove button</w:t>
+            </w:r>
+          </w:p>
+        </w:tc>
+      </w:tr>
+      <w:tr>
+        <w:trPr/>
+        <w:tc>
+          <w:tcPr>
+            <w:tcW w:w="3120" w:type="dxa"/>
+            <w:tcBorders/>
+          </w:tcPr>
+          <w:p>
+            <w:pPr>
+              <w:pStyle w:val="Normal"/>
+              <w:widowControl/>
+              <w:spacing w:lineRule="auto" w:line="240" w:before="0" w:after="40"/>
+              <w:jc w:val="left"/>
+              <w:rPr>
+                <w:rFonts w:eastAsia="ＭＳ 明朝" w:cs=""/>
+                <w:kern w:val="0"/>
+                <w:szCs w:val="22"/>
+                <w:lang w:val="en-US" w:eastAsia="en-US" w:bidi="ar-SA"/>
+              </w:rPr>
+            </w:pPr>
+            <w:r>
+              <w:rPr>
+                <w:rFonts w:eastAsia="ＭＳ 明朝" w:cs=""/>
+                <w:kern w:val="0"/>
+                <w:sz w:val="20"/>
+                <w:szCs w:val="22"/>
+                <w:lang w:val="en-US" w:eastAsia="en-US" w:bidi="ar-SA"/>
+              </w:rPr>
+              <w:t xml:space="preserve">T51</w:t>
+            </w:r>
+          </w:p>
+        </w:tc>
+        <w:tc>
+          <w:tcPr>
+            <w:tcW w:w="3120" w:type="dxa"/>
+            <w:tcBorders/>
+          </w:tcPr>
+          <w:p>
+            <w:pPr>
+              <w:pStyle w:val="Normal"/>
+              <w:widowControl/>
+              <w:spacing w:lineRule="auto" w:line="240" w:before="0" w:after="40"/>
+              <w:jc w:val="left"/>
+              <w:rPr>
+                <w:rFonts w:eastAsia="ＭＳ 明朝" w:cs=""/>
+                <w:kern w:val="0"/>
+                <w:szCs w:val="22"/>
+                <w:lang w:val="en-US" w:eastAsia="en-US" w:bidi="ar-SA"/>
+              </w:rPr>
+            </w:pPr>
+            <w:r>
+              <w:rPr>
+                <w:rFonts w:eastAsia="ＭＳ 明朝" w:cs=""/>
+                <w:kern w:val="0"/>
+                <w:sz w:val="20"/>
+                <w:szCs w:val="22"/>
+                <w:lang w:val="en-US" w:eastAsia="en-US" w:bidi="ar-SA"/>
+              </w:rPr>
+              <w:t xml:space="preserve">Mount the drive again; then run docker compose restart proxy, sign in again and mount it once more. Also docker run --rm -v mlw-storage_proxy-state:/s alpine cat /s/media.json</w:t>
+            </w:r>
+          </w:p>
+        </w:tc>
+        <w:tc>
+          <w:tcPr>
+            <w:tcW w:w="3120" w:type="dxa"/>
+            <w:tcBorders/>
+          </w:tcPr>
+          <w:p>
+            <w:pPr>
+              <w:pStyle w:val="Normal"/>
+              <w:widowControl/>
+              <w:spacing w:lineRule="auto" w:line="240" w:before="0" w:after="40"/>
+              <w:jc w:val="left"/>
+              <w:rPr>
+                <w:rFonts w:eastAsia="ＭＳ 明朝" w:cs=""/>
+                <w:kern w:val="0"/>
+                <w:szCs w:val="22"/>
+                <w:lang w:val="en-US" w:eastAsia="en-US" w:bidi="ar-SA"/>
+              </w:rPr>
+            </w:pPr>
+            <w:r>
+              <w:rPr>
+                <w:rFonts w:eastAsia="ＭＳ 明朝" w:cs=""/>
+                <w:kern w:val="0"/>
+                <w:sz w:val="20"/>
+                <w:szCs w:val="22"/>
+                <w:lang w:val="en-US" w:eastAsia="en-US" w:bidi="ar-SA"/>
+              </w:rPr>
+              <w:t xml:space="preserve">The drive is Available straight away, with no new prompt, both times; media.json holds an entry for its UUID with state "available"</w:t>
+            </w:r>
+          </w:p>
+        </w:tc>
+      </w:tr>
+      <w:tr>
+        <w:trPr/>
+        <w:tc>
+          <w:tcPr>
+            <w:tcW w:w="3120" w:type="dxa"/>
+            <w:tcBorders/>
+          </w:tcPr>
+          <w:p>
+            <w:pPr>
+              <w:pStyle w:val="Normal"/>
+              <w:widowControl/>
+              <w:spacing w:lineRule="auto" w:line="240" w:before="0" w:after="40"/>
+              <w:jc w:val="left"/>
+              <w:rPr>
+                <w:rFonts w:eastAsia="ＭＳ 明朝" w:cs=""/>
+                <w:kern w:val="0"/>
+                <w:szCs w:val="22"/>
+                <w:lang w:val="en-US" w:eastAsia="en-US" w:bidi="ar-SA"/>
+              </w:rPr>
+            </w:pPr>
+            <w:r>
+              <w:rPr>
+                <w:rFonts w:eastAsia="ＭＳ 明朝" w:cs=""/>
+                <w:kern w:val="0"/>
+                <w:sz w:val="20"/>
+                <w:szCs w:val="22"/>
+                <w:lang w:val="en-US" w:eastAsia="en-US" w:bidi="ar-SA"/>
+              </w:rPr>
+              <w:t xml:space="preserve">T52</w:t>
+            </w:r>
+          </w:p>
+        </w:tc>
+        <w:tc>
+          <w:tcPr>
+            <w:tcW w:w="3120" w:type="dxa"/>
+            <w:tcBorders/>
+          </w:tcPr>
+          <w:p>
+            <w:pPr>
+              <w:pStyle w:val="Normal"/>
+              <w:widowControl/>
+              <w:spacing w:lineRule="auto" w:line="240" w:before="0" w:after="40"/>
+              <w:jc w:val="left"/>
+              <w:rPr>
+                <w:rFonts w:eastAsia="ＭＳ 明朝" w:cs=""/>
+                <w:kern w:val="0"/>
+                <w:szCs w:val="22"/>
+                <w:lang w:val="en-US" w:eastAsia="en-US" w:bidi="ar-SA"/>
+              </w:rPr>
+            </w:pPr>
+            <w:r>
+              <w:rPr>
+                <w:rFonts w:eastAsia="ＭＳ 明朝" w:cs=""/>
+                <w:kern w:val="0"/>
+                <w:sz w:val="20"/>
+                <w:szCs w:val="22"/>
+                <w:lang w:val="en-US" w:eastAsia="en-US" w:bidi="ar-SA"/>
+              </w:rPr>
+              <w:t xml:space="preserve">Try Ignore on a new drive and unmount it; try Disable on an Available drive; try Remove on a Not mounted drive</w:t>
+            </w:r>
+          </w:p>
+        </w:tc>
+        <w:tc>
+          <w:tcPr>
+            <w:tcW w:w="3120" w:type="dxa"/>
+            <w:tcBorders/>
+          </w:tcPr>
+          <w:p>
+            <w:pPr>
+              <w:pStyle w:val="Normal"/>
+              <w:widowControl/>
+              <w:spacing w:lineRule="auto" w:line="240" w:before="0" w:after="40"/>
+              <w:jc w:val="left"/>
+              <w:rPr>
+                <w:rFonts w:eastAsia="ＭＳ 明朝" w:cs=""/>
+                <w:kern w:val="0"/>
+                <w:szCs w:val="22"/>
+                <w:lang w:val="en-US" w:eastAsia="en-US" w:bidi="ar-SA"/>
+              </w:rPr>
+            </w:pPr>
+            <w:r>
+              <w:rPr>
+                <w:rFonts w:eastAsia="ＭＳ 明朝" w:cs=""/>
+                <w:kern w:val="0"/>
+                <w:sz w:val="20"/>
+                <w:szCs w:val="22"/>
+                <w:lang w:val="en-US" w:eastAsia="en-US" w:bidi="ar-SA"/>
+              </w:rPr>
+              <w:t xml:space="preserve">Ignored shows an Enable button and the row disappears when the drive is unmounted; Disable makes the row Ignored; Remove deletes the row, and plugging the drive in again shows it as New</w:t>
+            </w:r>
+          </w:p>
+        </w:tc>
+      </w:tr>
+      <w:tr>
+        <w:trPr/>
+        <w:tc>
+          <w:tcPr>
+            <w:tcW w:w="3120" w:type="dxa"/>
+            <w:tcBorders/>
+          </w:tcPr>
+          <w:p>
+            <w:pPr>
+              <w:pStyle w:val="Normal"/>
+              <w:widowControl/>
+              <w:spacing w:lineRule="auto" w:line="240" w:before="0" w:after="40"/>
+              <w:jc w:val="left"/>
+              <w:rPr>
+                <w:rFonts w:eastAsia="ＭＳ 明朝" w:cs=""/>
+                <w:kern w:val="0"/>
+                <w:szCs w:val="22"/>
+                <w:lang w:val="en-US" w:eastAsia="en-US" w:bidi="ar-SA"/>
+              </w:rPr>
+            </w:pPr>
+            <w:r>
+              <w:rPr>
+                <w:rFonts w:eastAsia="ＭＳ 明朝" w:cs=""/>
+                <w:kern w:val="0"/>
+                <w:sz w:val="20"/>
+                <w:szCs w:val="22"/>
+                <w:lang w:val="en-US" w:eastAsia="en-US" w:bidi="ar-SA"/>
+              </w:rPr>
+              <w:t xml:space="preserve">T53</w:t>
+            </w:r>
+          </w:p>
+        </w:tc>
+        <w:tc>
+          <w:tcPr>
+            <w:tcW w:w="3120" w:type="dxa"/>
+            <w:tcBorders/>
+          </w:tcPr>
+          <w:p>
+            <w:pPr>
+              <w:pStyle w:val="Normal"/>
+              <w:widowControl/>
+              <w:spacing w:lineRule="auto" w:line="240" w:before="0" w:after="40"/>
+              <w:jc w:val="left"/>
+              <w:rPr>
+                <w:rFonts w:eastAsia="ＭＳ 明朝" w:cs=""/>
+                <w:kern w:val="0"/>
+                <w:szCs w:val="22"/>
+                <w:lang w:val="en-US" w:eastAsia="en-US" w:bidi="ar-SA"/>
+              </w:rPr>
+            </w:pPr>
+            <w:r>
+              <w:rPr>
+                <w:rFonts w:eastAsia="ＭＳ 明朝" w:cs=""/>
+                <w:kern w:val="0"/>
+                <w:sz w:val="20"/>
+                <w:szCs w:val="22"/>
+                <w:lang w:val="en-US" w:eastAsia="en-US" w:bidi="ar-SA"/>
+              </w:rPr>
+              <w:t xml:space="preserve">curl -s -o /dev/null -w "%{http_code}\n" $B/mlw/drives/table and $B/mlw/drives/events without signing in; then curl -s -o /dev/null -w "%{http_code}\n" -d key=x $B/mlw/drives/enable and the same with -H "Origin: http://evil.example"</w:t>
+            </w:r>
+          </w:p>
+        </w:tc>
+        <w:tc>
+          <w:tcPr>
+            <w:tcW w:w="3120" w:type="dxa"/>
+            <w:tcBorders/>
+          </w:tcPr>
+          <w:p>
+            <w:pPr>
+              <w:pStyle w:val="Normal"/>
+              <w:widowControl/>
+              <w:spacing w:lineRule="auto" w:line="240" w:before="0" w:after="40"/>
+              <w:jc w:val="left"/>
+              <w:rPr>
+                <w:rFonts w:eastAsia="ＭＳ 明朝" w:cs=""/>
+                <w:kern w:val="0"/>
+                <w:szCs w:val="22"/>
+                <w:lang w:val="en-US" w:eastAsia="en-US" w:bidi="ar-SA"/>
+              </w:rPr>
+            </w:pPr>
+            <w:r>
+              <w:rPr>
+                <w:rFonts w:eastAsia="ＭＳ 明朝" w:cs=""/>
+                <w:kern w:val="0"/>
+                <w:sz w:val="20"/>
+                <w:szCs w:val="22"/>
+                <w:lang w:val="en-US" w:eastAsia="en-US" w:bidi="ar-SA"/>
+              </w:rPr>
+              <w:t xml:space="preserve">401, 401, then 403 and 403 (no state is changed)</w:t>
+            </w:r>
+          </w:p>
+        </w:tc>
+      </w:tr>
+    </w:tbl>
+    <w:p>
+      <w:pPr>
+        <w:pStyle w:val="Normal"/>
+        <w:rPr/>
+      </w:pPr>
+      <w:r>
+        <w:rPr/>
+        <w:t xml:space="preserve">Notes for T47 to T52: the first mount after the stack starts can take a moment while the desktop mounts the drive. udisks mounts are often readable only by your user, so the Capacity column may show only the device size. Clean up afterwards: Remove the test entry, run udisksctl unmount -b /dev/loopN and udisksctl loop-delete -b /dev/loopN, and remove MLW_MEDIA_INCLUDE_VIRTUAL if you set it.</w:t>
+      </w:r>
+    </w:p>
+    <w:p>
+      <w:pPr>
+        <w:pStyle w:val="Heading1"/>
+        <w:rPr/>
+      </w:pPr>
+      <w:bookmarkStart w:id="909" w:name="_Toc100009"/>
+      <w:r>
+        <w:rPr/>
         <w:t>6. Failure behaviour</w:t>
       </w:r>
-      <w:bookmarkEnd w:id="908"/>
+      <w:bookmarkEnd w:id="909"/>
     </w:p>
     <w:p>
       <w:pPr>
@@ -6714,12 +7796,12 @@
         <w:pStyle w:val="Heading1"/>
         <w:rPr/>
       </w:pPr>
-      <w:bookmarkStart w:id="909" w:name="_Toc100009"/>
+      <w:bookmarkStart w:id="910" w:name="_Toc100010"/>
       <w:r>
         <w:rPr/>
         <w:t>7. Unit tests and static checks</w:t>
       </w:r>
-      <w:bookmarkEnd w:id="909"/>
+      <w:bookmarkEnd w:id="910"/>
     </w:p>
     <w:p>
       <w:pPr>
@@ -6754,7 +7836,7 @@
       </w:pPr>
       <w:r>
         <w:rPr/>
-        <w:t>Expected output: ok for the package, with no gofmt or vet complaints. The same checks run in GitHub Actions (.github/workflows/test.yml) on every push to main and on pull requests, together with validation of the development and production compose files (with and without the Keycloak override) and a build of the gateway image. The tests cover:</w:t>
+        <w:t>Expected output: ok for the package, with no gofmt or vet complaints. The same checks run in GitHub Actions (.github/workflows/test.yml) on every push to main and on pull requests, together with validation of the development and production compose files (with and without the Keycloak override), the drive detection overlay, and a build of the gateway image. The tests cover:</w:t>
       </w:r>
     </w:p>
     <w:p>
@@ -6843,15 +7925,29 @@
     </w:p>
     <w:p>
       <w:pPr>
+        <w:pStyle w:val="ListBullet"/>
+        <w:numPr>
+          <w:ilvl w:val="0"/>
+          <w:numId w:val="1"/>
+        </w:numPr>
+        <w:rPr/>
+      </w:pPr>
+      <w:r>
+        <w:rPr/>
+        <w:t xml:space="preserve">Drive detection: mountinfo parsing and octal escapes; the physical-device filter over a fake sysfs (USB, internal NVMe, loop, an unlocked LUKS volume on a physical disk, a duplicate mount, an NFS share and a disk outside the media directory); enable, ignore and remove decisions and their persistence across restarts; usage from statfs; wake-ups only on a real change; the epoll watch itself (against /proc/self/mountinfo, and, when run as root, waking on a real tmpfs mount in a private mount namespace); and the Drives page, its count, actions, same-site and session checks and event stream.</w:t>
+      </w:r>
+    </w:p>
+    <w:p>
+      <w:pPr>
         <w:pStyle w:val="Heading1"/>
         <w:rPr/>
       </w:pPr>
-      <w:bookmarkStart w:id="910" w:name="_Toc100010"/>
+      <w:bookmarkStart w:id="911" w:name="_Toc100011"/>
       <w:r>
         <w:rPr/>
         <w:t>8. Cleanup</w:t>
       </w:r>
-      <w:bookmarkEnd w:id="910"/>
+      <w:bookmarkEnd w:id="911"/>
     </w:p>
     <w:p>
       <w:pPr>
@@ -6890,12 +7986,12 @@
         <w:pStyle w:val="Heading1"/>
         <w:rPr/>
       </w:pPr>
-      <w:bookmarkStart w:id="911" w:name="_Toc100011"/>
+      <w:bookmarkStart w:id="912" w:name="_Toc100012"/>
       <w:r>
         <w:rPr/>
         <w:t>9. Troubleshooting</w:t>
       </w:r>
-      <w:bookmarkEnd w:id="911"/>
+      <w:bookmarkEnd w:id="912"/>
     </w:p>
     <w:tbl>
       <w:tblPr>
@@ -7313,12 +8409,12 @@
         <w:pStyle w:val="Heading1"/>
         <w:rPr/>
       </w:pPr>
-      <w:bookmarkStart w:id="912" w:name="_Toc100012"/>
+      <w:bookmarkStart w:id="913" w:name="_Toc100013"/>
       <w:r>
         <w:rPr/>
         <w:t>10. Known gaps</w:t>
       </w:r>
-      <w:bookmarkEnd w:id="912"/>
+      <w:bookmarkEnd w:id="913"/>
     </w:p>
     <w:p>
       <w:pPr>
@@ -7331,7 +8427,7 @@
       </w:pPr>
       <w:r>
         <w:rPr/>
-        <w:t>CI runs only the unit tests, static checks, compose validation (development and production files) and image build; the end-to-end procedures, including the production tests T27 to T33, are manual. CI validates docker-compose.prod.yml but never starts it.</w:t>
+        <w:t>CI runs only the unit tests, static checks, compose validation (development and production files) and image build; the end-to-end procedures, including the production tests T27 to T33 and T45 to T53, are manual. CI validates docker-compose.prod.yml but never starts it. The epoll wake-up test needs root and is skipped in CI; it was run once in a privileged container.</w:t>
       </w:r>
     </w:p>
     <w:p>

</xml_diff>